<commit_message>
docs: add audited training time calculation
</commit_message>
<xml_diff>
--- a/docs/reviews/china_alpha_earth_three_plans_report_reviewed_20260716.docx
+++ b/docs/reviews/china_alpha_earth_three_plans_report_reviewed_20260716.docx
@@ -7,12 +7,12 @@
         <w:pStyle w:val="1"/>
       </w:pPr>
       <w:commentRangeStart w:id="11"/>
-      <w:del w:id="1" w:author="Codex 审阅" w:date="2026-07-16T06:26:50+00:00">
+      <w:del w:id="1" w:author="Codex 审阅" w:date="2026-07-16T06:46:51+00:00">
         <w:r>
           <w:delText>中国版Alpha Earth 三个落地方案</w:delText>
         </w:r>
       </w:del>
-      <w:ins w:id="2" w:author="Codex 审阅" w:date="2026-07-16T06:26:50+00:00">
+      <w:ins w:id="2" w:author="Codex 审阅" w:date="2026-07-16T06:46:51+00:00">
         <w:r>
           <w:t>中国版 AlphaEarth：10 m 国家级地球观测嵌入的分阶段建设方案</w:t>
         </w:r>
@@ -27,12 +27,12 @@
         <w:pStyle w:val="aa"/>
       </w:pPr>
       <w:commentRangeStart w:id="0"/>
-      <w:del w:id="3" w:author="Codex 审阅" w:date="2026-07-16T06:26:50+00:00">
+      <w:del w:id="3" w:author="Codex 审阅" w:date="2026-07-16T06:46:51+00:00">
         <w:r>
           <w:delText>现有资源：16张昇腾910B | DDL：2026年11月30日 | 启动日期：2026年8月1日</w:delText>
         </w:r>
       </w:del>
-      <w:ins w:id="4" w:author="Codex 审阅" w:date="2026-07-16T06:26:50+00:00">
+      <w:ins w:id="4" w:author="Codex 审阅" w:date="2026-07-16T06:46:51+00:00">
         <w:r>
           <w:t>拟可用资源：16 张昇腾 910B（须完成多节点 HCCL 拓扑、排期与稳定性验收；本项目已验证 6 卡并行） | 目标里程碑：2026 年 11 月 30 日 | 拟启动：2026 年 8 月 1 日</w:t>
         </w:r>
@@ -317,12 +317,12 @@
         <w:pStyle w:val="aa"/>
       </w:pPr>
       <w:commentRangeStart w:id="1"/>
-      <w:del w:id="5" w:author="Codex 审阅" w:date="2026-07-16T06:26:50+00:00">
+      <w:del w:id="5" w:author="Codex 审阅" w:date="2026-07-16T06:46:51+00:00">
         <w:r>
           <w:delText>资源不变，缩小范围，三档分辨率验证</w:delText>
         </w:r>
       </w:del>
-      <w:ins w:id="6" w:author="Codex 审阅" w:date="2026-07-16T06:26:50+00:00">
+      <w:ins w:id="6" w:author="Codex 审阅" w:date="2026-07-16T06:46:51+00:00">
         <w:r>
           <w:t>资源不变，先完成 10 m 多模态月度嵌入试点；5 m/2 m 仅在高分数据授权、覆盖和配准通过后作为区域增强验证</w:t>
         </w:r>
@@ -337,12 +337,12 @@
         <w:pStyle w:val="FirstParagraph"/>
       </w:pPr>
       <w:commentRangeStart w:id="2"/>
-      <w:del w:id="7" w:author="Codex 审阅" w:date="2026-07-16T06:26:50+00:00">
+      <w:del w:id="7" w:author="Codex 审阅" w:date="2026-07-16T06:46:51+00:00">
         <w:r>
           <w:delText>东北训练面积：80.8万km² × 30% = 24.2万km² | 可用训练窗口：107天</w:delText>
         </w:r>
       </w:del>
-      <w:ins w:id="8" w:author="Codex 审阅" w:date="2026-07-16T06:26:50+00:00">
+      <w:ins w:id="8" w:author="Codex 审阅" w:date="2026-07-16T06:46:51+00:00">
         <w:r>
           <w:t>东北训练范围：80.8 万 km² × 30% = 24.2 万 km²；须说明 30% 的分层抽样规则、覆盖生态区和每月有效观测阈值 | 名义训练窗口：107 天</w:t>
         </w:r>
@@ -654,12 +654,12 @@
         <w:pStyle w:val="a0"/>
       </w:pPr>
       <w:commentRangeStart w:id="3"/>
-      <w:del w:id="9" w:author="Codex 审阅" w:date="2026-07-16T06:26:50+00:00">
+      <w:del w:id="9" w:author="Codex 审阅" w:date="2026-07-16T06:46:51+00:00">
         <w:r>
           <w:delText>建议：优先做10m东北底座，22天即可完成，作为团队技术验证和首版成果。</w:delText>
         </w:r>
       </w:del>
-      <w:ins w:id="10" w:author="Codex 审阅" w:date="2026-07-16T06:26:50+00:00">
+      <w:ins w:id="10" w:author="Codex 审阅" w:date="2026-07-16T06:46:51+00:00">
         <w:r>
           <w:t>建议：优先建设 10 m 东北试点底座，先用固定优化步数的 1,000-step 吞吐基准和数据就绪率复算工期，再作为团队技术验证与首版成果。</w:t>
         </w:r>
@@ -946,12 +946,12 @@
               <w:pStyle w:val="Compact"/>
             </w:pPr>
             <w:commentRangeStart w:id="8"/>
-            <w:del w:id="19" w:author="Codex 审阅" w:date="2026-07-16T06:26:50+00:00">
+            <w:del w:id="19" w:author="Codex 审阅" w:date="2026-07-16T06:46:51+00:00">
               <w:r>
                 <w:delText>如需107天完成，需追加</w:delText>
               </w:r>
             </w:del>
-            <w:ins w:id="20" w:author="Codex 审阅" w:date="2026-07-16T06:26:50+00:00">
+            <w:ins w:id="20" w:author="Codex 审阅" w:date="2026-07-16T06:46:51+00:00">
               <w:r>
                 <w:t>如需 107 天完成（线性外推，未计多节点效率损失）</w:t>
               </w:r>
@@ -970,12 +970,12 @@
             <w:pPr>
               <w:pStyle w:val="Compact"/>
             </w:pPr>
-            <w:del w:id="21" w:author="Codex 审阅" w:date="2026-07-16T06:26:50+00:00">
+            <w:del w:id="21" w:author="Codex 审阅" w:date="2026-07-16T06:46:51+00:00">
               <w:r>
                 <w:delText>29卡910B（共45卡）</w:delText>
               </w:r>
             </w:del>
-            <w:ins w:id="22" w:author="Codex 审阅" w:date="2026-07-16T06:26:50+00:00">
+            <w:ins w:id="22" w:author="Codex 审阅" w:date="2026-07-16T06:46:51+00:00">
               <w:r>
                 <w:t>约需追加 24 张 910B（共 40 张）；最终数值须由固定步数吞吐基准复算</w:t>
               </w:r>
@@ -1053,12 +1053,12 @@
         <w:pStyle w:val="2"/>
       </w:pPr>
       <w:commentRangeStart w:id="10"/>
-      <w:del w:id="11" w:author="Codex 审阅" w:date="2026-07-16T06:26:50+00:00">
+      <w:del w:id="11" w:author="Codex 审阅" w:date="2026-07-16T06:46:51+00:00">
         <w:r>
           <w:delText>方案三：采购扩充算力，全国三档分辨率，61天DDL</w:delText>
         </w:r>
       </w:del>
-      <w:ins w:id="12" w:author="Codex 审阅" w:date="2026-07-16T06:26:50+00:00">
+      <w:ins w:id="12" w:author="Codex 审阅" w:date="2026-07-16T06:46:51+00:00">
         <w:r>
           <w:t>方案三：在通过数据与吞吐阶段门后扩充算力，建设全国 10 m 主底座；5 m/2 m 作为有授权高分数据支撑的区域增强路线</w:t>
         </w:r>
@@ -1073,12 +1073,12 @@
         <w:pStyle w:val="aa"/>
       </w:pPr>
       <w:commentRangeStart w:id="4"/>
-      <w:del w:id="13" w:author="Codex 审阅" w:date="2026-07-16T06:26:50+00:00">
+      <w:del w:id="13" w:author="Codex 审阅" w:date="2026-07-16T06:46:51+00:00">
         <w:r>
           <w:delText>可采购H100/H800/A100/A800/910C，10/1-11/30完成训练</w:delText>
         </w:r>
       </w:del>
-      <w:ins w:id="14" w:author="Codex 审阅" w:date="2026-07-16T06:26:50+00:00">
+      <w:ins w:id="14" w:author="Codex 审阅" w:date="2026-07-16T06:46:51+00:00">
         <w:r>
           <w:t>候选算力包括 910C 与合规可采购 GPU；10/1-11/30 仅作为目标训练窗口，须在前置数据就绪、集群网络、HCCL 扩展效率与 1,000-step 基准验收后确认</w:t>
         </w:r>
@@ -1153,12 +1153,12 @@
               <w:pStyle w:val="Compact"/>
             </w:pPr>
             <w:commentRangeStart w:id="5"/>
-            <w:del w:id="23" w:author="Codex 审阅" w:date="2026-07-16T06:26:50+00:00">
+            <w:del w:id="23" w:author="Codex 审阅" w:date="2026-07-16T06:46:51+00:00">
               <w:r>
                 <w:delText>有效算力</w:delText>
               </w:r>
             </w:del>
-            <w:ins w:id="24" w:author="Codex 审阅" w:date="2026-07-16T06:26:50+00:00">
+            <w:ins w:id="24" w:author="Codex 审阅" w:date="2026-07-16T06:46:51+00:00">
               <w:r>
                 <w:t>有效训练吞吐（待实测）</w:t>
               </w:r>
@@ -1853,12 +1853,12 @@
               <w:pStyle w:val="Compact"/>
             </w:pPr>
             <w:commentRangeStart w:id="6"/>
-            <w:del w:id="25" w:author="Codex 审阅" w:date="2026-07-16T06:26:50+00:00">
+            <w:del w:id="25" w:author="Codex 审阅" w:date="2026-07-16T06:46:51+00:00">
               <w:r>
                 <w:delText>单卡参考价</w:delText>
               </w:r>
             </w:del>
-            <w:ins w:id="26" w:author="Codex 审阅" w:date="2026-07-16T06:26:50+00:00">
+            <w:ins w:id="26" w:author="Codex 审阅" w:date="2026-07-16T06:46:51+00:00">
               <w:r>
                 <w:t>采购估算单价（须询价）</w:t>
               </w:r>
@@ -2773,12 +2773,12 @@
           <w:numId w:val="12"/>
         </w:numPr>
       </w:pPr>
-      <w:del w:id="15" w:author="Codex 审阅" w:date="2026-07-16T06:26:50+00:00">
+      <w:del w:id="15" w:author="Codex 审阅" w:date="2026-07-16T06:46:51+00:00">
         <w:r>
           <w:delText>10m/5m目标：910C即可满足，64-256卡，成本仅0.04-0.18亿，强烈推荐。</w:delText>
         </w:r>
       </w:del>
-      <w:ins w:id="16" w:author="Codex 审阅" w:date="2026-07-16T06:26:50+00:00">
+      <w:ins w:id="16" w:author="Codex 审阅" w:date="2026-07-16T06:46:51+00:00">
         <w:r>
           <w:t>10 m 目标：以实测吞吐、并行效率和全口径 TCO 为依据确定 910C 集群规模；5 m 只有在全国高分数据的授权、覆盖、时相与配准均满足时才进入预算评审。</w:t>
         </w:r>
@@ -2793,12 +2793,12 @@
         </w:numPr>
       </w:pPr>
       <w:commentRangeStart w:id="7"/>
-      <w:del w:id="17" w:author="Codex 审阅" w:date="2026-07-16T06:26:50+00:00">
+      <w:del w:id="17" w:author="Codex 审阅" w:date="2026-07-16T06:46:51+00:00">
         <w:r>
           <w:delText>2m目标：成本跃升至1.8-4.2亿，卡数需求1,600-2,800张。受8/1启动、61天训练窗口限制，卡数需求比6/22启动方案增加约60%。</w:delText>
         </w:r>
       </w:del>
-      <w:ins w:id="18" w:author="Codex 审阅" w:date="2026-07-16T06:26:50+00:00">
+      <w:ins w:id="18" w:author="Codex 审阅" w:date="2026-07-16T06:46:51+00:00">
         <w:r>
           <w:t>2 m 目标不应与全国 10 m 主预训练并列承诺：其主要瓶颈是高分数据授权与覆盖、存储和 I/O，而非单纯卡数；建议改为完成 10 m 主底座后的重点城市/行业区域增强路线。</w:t>
         </w:r>
@@ -4392,105 +4392,105 @@
 
 <file path=word/comments.xml><?xml version="1.0" encoding="utf-8"?>
 <w:comments xmlns:w="http://schemas.openxmlformats.org/wordprocessingml/2006/main">
-  <w:comment w:id="0" w:author="Codex 审阅" w:date="2026-07-16T06:26:50+00:00">
+  <w:comment w:id="0" w:author="Codex 审阅" w:date="2026-07-16T06:46:51+00:00">
     <w:p>
       <w:r>
-        <w:t>资源口径需要拆开写：当前节点可见 8 张 910B4，项目已稳定验证 6 卡并行；“16 卡”若为两节点集群，须在立项前写明节点数、每节点卡数、HCCL 拓扑、网络带宽、可独占时段和故障替补策略。</w:t>
+        <w:t>资源口径需要拆开写：当前节点可见 8 张 910B4，项目已稳定验证 6 卡并行；P10C 海淀生产基线（320 patch、6 个月、800 epoch、每卡 batch=3、梯度累积=2）从 2026-07-04 16:53:29 至 2026-07-05 10:43:01 保存 epoch_800，实测 17 小时49分32秒。该时间包含验证/保存，不含导出和下游评测，且从 P9B 权重继续训练，不能写作从零预训练。“16 卡”若为两节点集群，须再写明节点数、HCCL 拓扑、网络带宽、可独占时段和故障替补策略。</w:t>
       </w:r>
     </w:p>
   </w:comment>
-  <w:comment w:id="1" w:author="Codex 审阅" w:date="2026-07-16T06:26:50+00:00">
+  <w:comment w:id="1" w:author="Codex 审阅" w:date="2026-07-16T06:46:51+00:00">
     <w:p>
       <w:r>
         <w:t>关键技术修改：Sentinel-2/Sentinel-1/Landsat 的原生空间信息不是 5 m 或 2 m。把全国主预训练直接改成 5 m/2 m 会把上采样当成新增信息。建议明确：10 m 是主 embedding 网格；高分光学/SAR 是稀疏辅助模态；5 m/2 m 仅依赖另行取得且可合法训练的高分数据。</w:t>
       </w:r>
     </w:p>
   </w:comment>
-  <w:comment w:id="2" w:author="Codex 审阅" w:date="2026-07-16T06:26:50+00:00">
+  <w:comment w:id="2" w:author="Codex 审阅" w:date="2026-07-16T06:46:51+00:00">
     <w:p>
       <w:r>
         <w:t>“30%”不能只是面积比例。需在附录列出分层：省份/生态区/土地覆盖/城乡梯度/云量带，并固定每月最小有效像素比例。否则训练集可能集中在易获取、低云区域，无法代表中国尺度泛化。</w:t>
       </w:r>
     </w:p>
   </w:comment>
-  <w:comment w:id="3" w:author="Codex 审阅" w:date="2026-07-16T06:26:50+00:00">
+  <w:comment w:id="3" w:author="Codex 审阅" w:date="2026-07-16T06:46:51+00:00">
     <w:p>
       <w:r>
-        <w:t>请删去把“小数据 800 epoch”直接放大到全国的做法。样本规模改变后，epoch 不是可比的算力单位；应统一为优化步数、全局 batch、有效像素数、混合精度、数据读取命中率和实际 samples/s。先跑 1,000 step 基准，再得出卡数和 ETA。</w:t>
+        <w:t>请删去把“小数据 800 epoch”直接放大到全国的做法。P10C 海淀实测为 320×800=25.6 万 patch-visits，6 卡 17小时49分32秒，即 2,393.6 patch-visits/卡·小时；全国30%约175.8万 patch，若仍跑800 epoch，16卡完全线性也约需1,530天。样本规模改变后，epoch不是可比单位；应统一为优化步数、全局 batch、有效像素数、混合精度、数据读取命中率和实际 samples/s。先跑 1,000 step 基准，再得出卡数和 ETA。</w:t>
       </w:r>
     </w:p>
   </w:comment>
-  <w:comment w:id="4" w:author="Codex 审阅" w:date="2026-07-16T06:26:50+00:00">
+  <w:comment w:id="4" w:author="Codex 审阅" w:date="2026-07-16T06:46:51+00:00">
     <w:p>
       <w:r>
         <w:t>采购表要把“加速卡数量”改为“完整集群”：计算卡、节点 CPU/RAM、本地 NVMe 缓存、RoCE/IB 网络、对象存储、备份、运维和电力。全国数据训练常先被 I/O 限速，单卡 TFLOPS 不能直接推导完成天数。</w:t>
       </w:r>
     </w:p>
   </w:comment>
-  <w:comment w:id="5" w:author="Codex 审阅" w:date="2026-07-16T06:26:50+00:00">
+  <w:comment w:id="5" w:author="Codex 审阅" w:date="2026-07-16T06:46:51+00:00">
     <w:p>
       <w:r>
         <w:t>建议删除或弱化这一列的纯 TFLOPS 比较。不同卡的 BF16/FP16、算子、显存、通信、软件栈和数据管线不同；请改为同一训练脚本、同一全局 batch 下的实测 step/s、tokens/pixels/s 与 16/32/64 卡扩展效率。</w:t>
       </w:r>
     </w:p>
   </w:comment>
-  <w:comment w:id="6" w:author="Codex 审阅" w:date="2026-07-16T06:26:50+00:00">
+  <w:comment w:id="6" w:author="Codex 审阅" w:date="2026-07-16T06:46:51+00:00">
     <w:p>
       <w:r>
         <w:t>价格不能作为固定事实。补充“报价日期、含税/维保年限、服务器与网络是否包含、采购或租赁、交期、替代料”。尤其 H800/A800 的可得性与合规性需要供应商书面确认。</w:t>
       </w:r>
     </w:p>
   </w:comment>
-  <w:comment w:id="7" w:author="Codex 审阅" w:date="2026-07-16T06:26:50+00:00">
+  <w:comment w:id="7" w:author="Codex 审阅" w:date="2026-07-16T06:46:51+00:00">
     <w:p>
       <w:r>
         <w:t>按当前项目 64 维、128×128、FP16 月度 embedding 的输出格式线性估算，30% 全国、6 个月的 10 m embedding 约 22 TB；5 m 约 88 TB；2 m 约 553 TB，尚未包括输入、临时缓存、版本和副本。因此 2 m 必须单列数据、存储和交付方案。</w:t>
       </w:r>
     </w:p>
   </w:comment>
-  <w:comment w:id="8" w:author="Codex 审阅" w:date="2026-07-16T06:26:50+00:00">
+  <w:comment w:id="8" w:author="Codex 审阅" w:date="2026-07-16T06:46:51+00:00">
     <w:p>
       <w:r>
         <w:t>原表存在算术不一致：265 天在 16 卡上的工作量若压缩到 107 天，线性比例为 265/107×16≈40 张，总追加约 24 张，不是 45 张总量。更重要的是，多节点通信损失会使线性估算偏乐观。</w:t>
       </w:r>
     </w:p>
   </w:comment>
-  <w:comment w:id="9" w:author="Codex 审阅" w:date="2026-07-16T06:26:50+00:00">
+  <w:comment w:id="9" w:author="Codex 审阅" w:date="2026-07-16T06:46:51+00:00">
     <w:p>
       <w:r>
         <w:t>请勿默认 910B 与 H 系列/A 系列可以混入同一个分布式训练作业并线性抵扣采购卡数。若不能完成混合 HCCL/NCCL 和算子兼容性压测，现有 910B 应单独承担数据预处理、评测、消融或独立训练。</w:t>
       </w:r>
     </w:p>
   </w:comment>
-  <w:comment w:id="10" w:author="Codex 审阅" w:date="2026-07-16T06:26:50+00:00">
+  <w:comment w:id="10" w:author="Codex 审阅" w:date="2026-07-16T06:46:51+00:00">
     <w:p>
       <w:r>
         <w:t>建议新增“阶段门与验收指标”一页：G0 数据许可/覆盖/云质量通过；G1 10 万 patch 数据管线通过；G2 16→32→64 卡扩展效率≥70%；G3 跨区域轻量 probe 和少样本任务优于 raw/传统基线；G4 发布前独立标签与时相留出评测。没有这些门，采购规模无法被审计。</w:t>
       </w:r>
     </w:p>
   </w:comment>
-  <w:comment w:id="11" w:author="Codex 审阅" w:date="2026-07-16T06:26:50+00:00">
+  <w:comment w:id="11" w:author="Codex 审阅" w:date="2026-07-16T06:46:51+00:00">
     <w:p>
       <w:r>
         <w:t>建议在首页增加一句定位：本项目借鉴 AlphaEarth 的“多源观测→统一 embedding→少标签下游制图”范式，但不是对官方模型的复刻或性能等价声明。官方公开产品是年度 10 m、64 维 embedding；本项目可突出中国数据源和月度更新能力。</w:t>
       </w:r>
     </w:p>
   </w:comment>
-  <w:comment w:id="12" w:author="Codex 审阅" w:date="2026-07-16T06:26:50+00:00">
+  <w:comment w:id="12" w:author="Codex 审阅" w:date="2026-07-16T06:46:51+00:00">
     <w:p>
       <w:r>
         <w:t>此行有明确逻辑矛盾：6/22 启动时的可用训练窗口为 122 天，表二给出的 5 m 训练需 161 天，仍超期 39 天，不能标为“可接受”。应改为不可行，或列出新增资源/不同训练配方的假设。</w:t>
       </w:r>
     </w:p>
   </w:comment>
-  <w:comment w:id="13" w:author="Codex 审阅" w:date="2026-07-16T06:26:50+00:00">
+  <w:comment w:id="13" w:author="Codex 审阅" w:date="2026-07-16T06:46:51+00:00">
     <w:p>
       <w:r>
         <w:t>表八称 76 天缩至 61 天后所需卡数由 128 增至 256；若其他条件不变，线性倍率仅为 76/61≈1.25。该表混用了不同芯片、不同配方或未说明裕量，必须按同一实测吞吐公式重算。</w:t>
       </w:r>
     </w:p>
   </w:comment>
-  <w:comment w:id="14" w:author="Codex 审阅" w:date="2026-07-16T06:26:50+00:00">
+  <w:comment w:id="14" w:author="Codex 审阅" w:date="2026-07-16T06:46:51+00:00">
     <w:p>
       <w:r>
         <w:t>1,280 到 1,664–2,816 的增幅为约 30%–120%，不是表中写的“30–55%”。更重要的是，当前数据只有约 3 m 高分光学/SAR，并不能验证全国 2 m 训练数据是否存在。</w:t>

</xml_diff>

<commit_message>
docs: estimate scaled training and infrastructure
</commit_message>
<xml_diff>
--- a/docs/reviews/china_alpha_earth_three_plans_report_reviewed_20260716.docx
+++ b/docs/reviews/china_alpha_earth_three_plans_report_reviewed_20260716.docx
@@ -7,12 +7,12 @@
         <w:pStyle w:val="1"/>
       </w:pPr>
       <w:commentRangeStart w:id="11"/>
-      <w:del w:id="1" w:author="Codex 审阅" w:date="2026-07-16T06:46:51+00:00">
+      <w:del w:id="1" w:author="Codex 审阅" w:date="2026-07-16T06:49:21+00:00">
         <w:r>
           <w:delText>中国版Alpha Earth 三个落地方案</w:delText>
         </w:r>
       </w:del>
-      <w:ins w:id="2" w:author="Codex 审阅" w:date="2026-07-16T06:46:51+00:00">
+      <w:ins w:id="2" w:author="Codex 审阅" w:date="2026-07-16T06:49:21+00:00">
         <w:r>
           <w:t>中国版 AlphaEarth：10 m 国家级地球观测嵌入的分阶段建设方案</w:t>
         </w:r>
@@ -27,12 +27,12 @@
         <w:pStyle w:val="aa"/>
       </w:pPr>
       <w:commentRangeStart w:id="0"/>
-      <w:del w:id="3" w:author="Codex 审阅" w:date="2026-07-16T06:46:51+00:00">
+      <w:del w:id="3" w:author="Codex 审阅" w:date="2026-07-16T06:49:21+00:00">
         <w:r>
           <w:delText>现有资源：16张昇腾910B | DDL：2026年11月30日 | 启动日期：2026年8月1日</w:delText>
         </w:r>
       </w:del>
-      <w:ins w:id="4" w:author="Codex 审阅" w:date="2026-07-16T06:46:51+00:00">
+      <w:ins w:id="4" w:author="Codex 审阅" w:date="2026-07-16T06:49:21+00:00">
         <w:r>
           <w:t>拟可用资源：16 张昇腾 910B（须完成多节点 HCCL 拓扑、排期与稳定性验收；本项目已验证 6 卡并行） | 目标里程碑：2026 年 11 月 30 日 | 拟启动：2026 年 8 月 1 日</w:t>
         </w:r>
@@ -317,12 +317,12 @@
         <w:pStyle w:val="aa"/>
       </w:pPr>
       <w:commentRangeStart w:id="1"/>
-      <w:del w:id="5" w:author="Codex 审阅" w:date="2026-07-16T06:46:51+00:00">
+      <w:del w:id="5" w:author="Codex 审阅" w:date="2026-07-16T06:49:21+00:00">
         <w:r>
           <w:delText>资源不变，缩小范围，三档分辨率验证</w:delText>
         </w:r>
       </w:del>
-      <w:ins w:id="6" w:author="Codex 审阅" w:date="2026-07-16T06:46:51+00:00">
+      <w:ins w:id="6" w:author="Codex 审阅" w:date="2026-07-16T06:49:21+00:00">
         <w:r>
           <w:t>资源不变，先完成 10 m 多模态月度嵌入试点；5 m/2 m 仅在高分数据授权、覆盖和配准通过后作为区域增强验证</w:t>
         </w:r>
@@ -337,12 +337,12 @@
         <w:pStyle w:val="FirstParagraph"/>
       </w:pPr>
       <w:commentRangeStart w:id="2"/>
-      <w:del w:id="7" w:author="Codex 审阅" w:date="2026-07-16T06:46:51+00:00">
+      <w:del w:id="7" w:author="Codex 审阅" w:date="2026-07-16T06:49:21+00:00">
         <w:r>
           <w:delText>东北训练面积：80.8万km² × 30% = 24.2万km² | 可用训练窗口：107天</w:delText>
         </w:r>
       </w:del>
-      <w:ins w:id="8" w:author="Codex 审阅" w:date="2026-07-16T06:46:51+00:00">
+      <w:ins w:id="8" w:author="Codex 审阅" w:date="2026-07-16T06:49:21+00:00">
         <w:r>
           <w:t>东北训练范围：80.8 万 km² × 30% = 24.2 万 km²；须说明 30% 的分层抽样规则、覆盖生态区和每月有效观测阈值 | 名义训练窗口：107 天</w:t>
         </w:r>
@@ -654,12 +654,12 @@
         <w:pStyle w:val="a0"/>
       </w:pPr>
       <w:commentRangeStart w:id="3"/>
-      <w:del w:id="9" w:author="Codex 审阅" w:date="2026-07-16T06:46:51+00:00">
+      <w:del w:id="9" w:author="Codex 审阅" w:date="2026-07-16T06:49:21+00:00">
         <w:r>
           <w:delText>建议：优先做10m东北底座，22天即可完成，作为团队技术验证和首版成果。</w:delText>
         </w:r>
       </w:del>
-      <w:ins w:id="10" w:author="Codex 审阅" w:date="2026-07-16T06:46:51+00:00">
+      <w:ins w:id="10" w:author="Codex 审阅" w:date="2026-07-16T06:49:21+00:00">
         <w:r>
           <w:t>建议：优先建设 10 m 东北试点底座，先用固定优化步数的 1,000-step 吞吐基准和数据就绪率复算工期，再作为团队技术验证与首版成果。</w:t>
         </w:r>
@@ -946,12 +946,12 @@
               <w:pStyle w:val="Compact"/>
             </w:pPr>
             <w:commentRangeStart w:id="8"/>
-            <w:del w:id="19" w:author="Codex 审阅" w:date="2026-07-16T06:46:51+00:00">
+            <w:del w:id="19" w:author="Codex 审阅" w:date="2026-07-16T06:49:21+00:00">
               <w:r>
                 <w:delText>如需107天完成，需追加</w:delText>
               </w:r>
             </w:del>
-            <w:ins w:id="20" w:author="Codex 审阅" w:date="2026-07-16T06:46:51+00:00">
+            <w:ins w:id="20" w:author="Codex 审阅" w:date="2026-07-16T06:49:21+00:00">
               <w:r>
                 <w:t>如需 107 天完成（线性外推，未计多节点效率损失）</w:t>
               </w:r>
@@ -970,12 +970,12 @@
             <w:pPr>
               <w:pStyle w:val="Compact"/>
             </w:pPr>
-            <w:del w:id="21" w:author="Codex 审阅" w:date="2026-07-16T06:46:51+00:00">
+            <w:del w:id="21" w:author="Codex 审阅" w:date="2026-07-16T06:49:21+00:00">
               <w:r>
                 <w:delText>29卡910B（共45卡）</w:delText>
               </w:r>
             </w:del>
-            <w:ins w:id="22" w:author="Codex 审阅" w:date="2026-07-16T06:46:51+00:00">
+            <w:ins w:id="22" w:author="Codex 审阅" w:date="2026-07-16T06:49:21+00:00">
               <w:r>
                 <w:t>约需追加 24 张 910B（共 40 张）；最终数值须由固定步数吞吐基准复算</w:t>
               </w:r>
@@ -1053,12 +1053,12 @@
         <w:pStyle w:val="2"/>
       </w:pPr>
       <w:commentRangeStart w:id="10"/>
-      <w:del w:id="11" w:author="Codex 审阅" w:date="2026-07-16T06:46:51+00:00">
+      <w:del w:id="11" w:author="Codex 审阅" w:date="2026-07-16T06:49:21+00:00">
         <w:r>
           <w:delText>方案三：采购扩充算力，全国三档分辨率，61天DDL</w:delText>
         </w:r>
       </w:del>
-      <w:ins w:id="12" w:author="Codex 审阅" w:date="2026-07-16T06:46:51+00:00">
+      <w:ins w:id="12" w:author="Codex 审阅" w:date="2026-07-16T06:49:21+00:00">
         <w:r>
           <w:t>方案三：在通过数据与吞吐阶段门后扩充算力，建设全国 10 m 主底座；5 m/2 m 作为有授权高分数据支撑的区域增强路线</w:t>
         </w:r>
@@ -1073,12 +1073,12 @@
         <w:pStyle w:val="aa"/>
       </w:pPr>
       <w:commentRangeStart w:id="4"/>
-      <w:del w:id="13" w:author="Codex 审阅" w:date="2026-07-16T06:46:51+00:00">
+      <w:del w:id="13" w:author="Codex 审阅" w:date="2026-07-16T06:49:21+00:00">
         <w:r>
           <w:delText>可采购H100/H800/A100/A800/910C，10/1-11/30完成训练</w:delText>
         </w:r>
       </w:del>
-      <w:ins w:id="14" w:author="Codex 审阅" w:date="2026-07-16T06:46:51+00:00">
+      <w:ins w:id="14" w:author="Codex 审阅" w:date="2026-07-16T06:49:21+00:00">
         <w:r>
           <w:t>候选算力包括 910C 与合规可采购 GPU；10/1-11/30 仅作为目标训练窗口，须在前置数据就绪、集群网络、HCCL 扩展效率与 1,000-step 基准验收后确认</w:t>
         </w:r>
@@ -1153,12 +1153,12 @@
               <w:pStyle w:val="Compact"/>
             </w:pPr>
             <w:commentRangeStart w:id="5"/>
-            <w:del w:id="23" w:author="Codex 审阅" w:date="2026-07-16T06:46:51+00:00">
+            <w:del w:id="23" w:author="Codex 审阅" w:date="2026-07-16T06:49:21+00:00">
               <w:r>
                 <w:delText>有效算力</w:delText>
               </w:r>
             </w:del>
-            <w:ins w:id="24" w:author="Codex 审阅" w:date="2026-07-16T06:46:51+00:00">
+            <w:ins w:id="24" w:author="Codex 审阅" w:date="2026-07-16T06:49:21+00:00">
               <w:r>
                 <w:t>有效训练吞吐（待实测）</w:t>
               </w:r>
@@ -1853,12 +1853,12 @@
               <w:pStyle w:val="Compact"/>
             </w:pPr>
             <w:commentRangeStart w:id="6"/>
-            <w:del w:id="25" w:author="Codex 审阅" w:date="2026-07-16T06:46:51+00:00">
+            <w:del w:id="25" w:author="Codex 审阅" w:date="2026-07-16T06:49:21+00:00">
               <w:r>
                 <w:delText>单卡参考价</w:delText>
               </w:r>
             </w:del>
-            <w:ins w:id="26" w:author="Codex 审阅" w:date="2026-07-16T06:46:51+00:00">
+            <w:ins w:id="26" w:author="Codex 审阅" w:date="2026-07-16T06:49:21+00:00">
               <w:r>
                 <w:t>采购估算单价（须询价）</w:t>
               </w:r>
@@ -2773,12 +2773,12 @@
           <w:numId w:val="12"/>
         </w:numPr>
       </w:pPr>
-      <w:del w:id="15" w:author="Codex 审阅" w:date="2026-07-16T06:46:51+00:00">
+      <w:del w:id="15" w:author="Codex 审阅" w:date="2026-07-16T06:49:21+00:00">
         <w:r>
           <w:delText>10m/5m目标：910C即可满足，64-256卡，成本仅0.04-0.18亿，强烈推荐。</w:delText>
         </w:r>
       </w:del>
-      <w:ins w:id="16" w:author="Codex 审阅" w:date="2026-07-16T06:46:51+00:00">
+      <w:ins w:id="16" w:author="Codex 审阅" w:date="2026-07-16T06:49:21+00:00">
         <w:r>
           <w:t>10 m 目标：以实测吞吐、并行效率和全口径 TCO 为依据确定 910C 集群规模；5 m 只有在全国高分数据的授权、覆盖、时相与配准均满足时才进入预算评审。</w:t>
         </w:r>
@@ -2793,12 +2793,12 @@
         </w:numPr>
       </w:pPr>
       <w:commentRangeStart w:id="7"/>
-      <w:del w:id="17" w:author="Codex 审阅" w:date="2026-07-16T06:46:51+00:00">
+      <w:del w:id="17" w:author="Codex 审阅" w:date="2026-07-16T06:49:21+00:00">
         <w:r>
           <w:delText>2m目标：成本跃升至1.8-4.2亿，卡数需求1,600-2,800张。受8/1启动、61天训练窗口限制，卡数需求比6/22启动方案增加约60%。</w:delText>
         </w:r>
       </w:del>
-      <w:ins w:id="18" w:author="Codex 审阅" w:date="2026-07-16T06:46:51+00:00">
+      <w:ins w:id="18" w:author="Codex 审阅" w:date="2026-07-16T06:49:21+00:00">
         <w:r>
           <w:t>2 m 目标不应与全国 10 m 主预训练并列承诺：其主要瓶颈是高分数据授权与覆盖、存储和 I/O，而非单纯卡数；建议改为完成 10 m 主底座后的重点城市/行业区域增强路线。</w:t>
         </w:r>
@@ -4392,105 +4392,105 @@
 
 <file path=word/comments.xml><?xml version="1.0" encoding="utf-8"?>
 <w:comments xmlns:w="http://schemas.openxmlformats.org/wordprocessingml/2006/main">
-  <w:comment w:id="0" w:author="Codex 审阅" w:date="2026-07-16T06:46:51+00:00">
+  <w:comment w:id="0" w:author="Codex 审阅" w:date="2026-07-16T06:49:21+00:00">
     <w:p>
       <w:r>
         <w:t>资源口径需要拆开写：当前节点可见 8 张 910B4，项目已稳定验证 6 卡并行；P10C 海淀生产基线（320 patch、6 个月、800 epoch、每卡 batch=3、梯度累积=2）从 2026-07-04 16:53:29 至 2026-07-05 10:43:01 保存 epoch_800，实测 17 小时49分32秒。该时间包含验证/保存，不含导出和下游评测，且从 P9B 权重继续训练，不能写作从零预训练。“16 卡”若为两节点集群，须再写明节点数、HCCL 拓扑、网络带宽、可独占时段和故障替补策略。</w:t>
       </w:r>
     </w:p>
   </w:comment>
-  <w:comment w:id="1" w:author="Codex 审阅" w:date="2026-07-16T06:46:51+00:00">
+  <w:comment w:id="1" w:author="Codex 审阅" w:date="2026-07-16T06:49:21+00:00">
     <w:p>
       <w:r>
         <w:t>关键技术修改：Sentinel-2/Sentinel-1/Landsat 的原生空间信息不是 5 m 或 2 m。把全国主预训练直接改成 5 m/2 m 会把上采样当成新增信息。建议明确：10 m 是主 embedding 网格；高分光学/SAR 是稀疏辅助模态；5 m/2 m 仅依赖另行取得且可合法训练的高分数据。</w:t>
       </w:r>
     </w:p>
   </w:comment>
-  <w:comment w:id="2" w:author="Codex 审阅" w:date="2026-07-16T06:46:51+00:00">
+  <w:comment w:id="2" w:author="Codex 审阅" w:date="2026-07-16T06:49:21+00:00">
     <w:p>
       <w:r>
         <w:t>“30%”不能只是面积比例。需在附录列出分层：省份/生态区/土地覆盖/城乡梯度/云量带，并固定每月最小有效像素比例。否则训练集可能集中在易获取、低云区域，无法代表中国尺度泛化。</w:t>
       </w:r>
     </w:p>
   </w:comment>
-  <w:comment w:id="3" w:author="Codex 审阅" w:date="2026-07-16T06:46:51+00:00">
+  <w:comment w:id="3" w:author="Codex 审阅" w:date="2026-07-16T06:49:21+00:00">
     <w:p>
       <w:r>
         <w:t>请删去把“小数据 800 epoch”直接放大到全国的做法。P10C 海淀实测为 320×800=25.6 万 patch-visits，6 卡 17小时49分32秒，即 2,393.6 patch-visits/卡·小时；全国30%约175.8万 patch，若仍跑800 epoch，16卡完全线性也约需1,530天。样本规模改变后，epoch不是可比单位；应统一为优化步数、全局 batch、有效像素数、混合精度、数据读取命中率和实际 samples/s。先跑 1,000 step 基准，再得出卡数和 ETA。</w:t>
       </w:r>
     </w:p>
   </w:comment>
-  <w:comment w:id="4" w:author="Codex 审阅" w:date="2026-07-16T06:46:51+00:00">
+  <w:comment w:id="4" w:author="Codex 审阅" w:date="2026-07-16T06:49:21+00:00">
     <w:p>
       <w:r>
         <w:t>采购表要把“加速卡数量”改为“完整集群”：计算卡、节点 CPU/RAM、本地 NVMe 缓存、RoCE/IB 网络、对象存储、备份、运维和电力。全国数据训练常先被 I/O 限速，单卡 TFLOPS 不能直接推导完成天数。</w:t>
       </w:r>
     </w:p>
   </w:comment>
-  <w:comment w:id="5" w:author="Codex 审阅" w:date="2026-07-16T06:46:51+00:00">
+  <w:comment w:id="5" w:author="Codex 审阅" w:date="2026-07-16T06:49:21+00:00">
     <w:p>
       <w:r>
         <w:t>建议删除或弱化这一列的纯 TFLOPS 比较。不同卡的 BF16/FP16、算子、显存、通信、软件栈和数据管线不同；请改为同一训练脚本、同一全局 batch 下的实测 step/s、tokens/pixels/s 与 16/32/64 卡扩展效率。</w:t>
       </w:r>
     </w:p>
   </w:comment>
-  <w:comment w:id="6" w:author="Codex 审阅" w:date="2026-07-16T06:46:51+00:00">
+  <w:comment w:id="6" w:author="Codex 审阅" w:date="2026-07-16T06:49:21+00:00">
     <w:p>
       <w:r>
         <w:t>价格不能作为固定事实。补充“报价日期、含税/维保年限、服务器与网络是否包含、采购或租赁、交期、替代料”。尤其 H800/A800 的可得性与合规性需要供应商书面确认。</w:t>
       </w:r>
     </w:p>
   </w:comment>
-  <w:comment w:id="7" w:author="Codex 审阅" w:date="2026-07-16T06:46:51+00:00">
+  <w:comment w:id="7" w:author="Codex 审阅" w:date="2026-07-16T06:49:21+00:00">
     <w:p>
       <w:r>
         <w:t>按当前项目 64 维、128×128、FP16 月度 embedding 的输出格式线性估算，30% 全国、6 个月的 10 m embedding 约 22 TB；5 m 约 88 TB；2 m 约 553 TB，尚未包括输入、临时缓存、版本和副本。因此 2 m 必须单列数据、存储和交付方案。</w:t>
       </w:r>
     </w:p>
   </w:comment>
-  <w:comment w:id="8" w:author="Codex 审阅" w:date="2026-07-16T06:46:51+00:00">
+  <w:comment w:id="8" w:author="Codex 审阅" w:date="2026-07-16T06:49:21+00:00">
     <w:p>
       <w:r>
         <w:t>原表存在算术不一致：265 天在 16 卡上的工作量若压缩到 107 天，线性比例为 265/107×16≈40 张，总追加约 24 张，不是 45 张总量。更重要的是，多节点通信损失会使线性估算偏乐观。</w:t>
       </w:r>
     </w:p>
   </w:comment>
-  <w:comment w:id="9" w:author="Codex 审阅" w:date="2026-07-16T06:46:51+00:00">
+  <w:comment w:id="9" w:author="Codex 审阅" w:date="2026-07-16T06:49:21+00:00">
     <w:p>
       <w:r>
         <w:t>请勿默认 910B 与 H 系列/A 系列可以混入同一个分布式训练作业并线性抵扣采购卡数。若不能完成混合 HCCL/NCCL 和算子兼容性压测，现有 910B 应单独承担数据预处理、评测、消融或独立训练。</w:t>
       </w:r>
     </w:p>
   </w:comment>
-  <w:comment w:id="10" w:author="Codex 审阅" w:date="2026-07-16T06:46:51+00:00">
+  <w:comment w:id="10" w:author="Codex 审阅" w:date="2026-07-16T06:49:21+00:00">
     <w:p>
       <w:r>
-        <w:t>建议新增“阶段门与验收指标”一页：G0 数据许可/覆盖/云质量通过；G1 10 万 patch 数据管线通过；G2 16→32→64 卡扩展效率≥70%；G3 跨区域轻量 probe 和少样本任务优于 raw/传统基线；G4 发布前独立标签与时相留出评测。没有这些门，采购规模无法被审计。</w:t>
+        <w:t>建议新增“阶段门与验收指标”一页：G0 数据许可/覆盖/云质量通过；G1 10 万 patch 数据管线通过；G2 16→24→32 卡扩展效率验收；G3 跨区域轻量 probe 和少样本任务优于 raw/传统基线；G4 发布前独立标签与时相留出评测。以当前P10C实测速率估算，40万 updates 在16卡、70%效率下含20%缓冲约71.6天，61天窗口不足；24张同构卡、68%效率下约49.1天，建议作为该目标的最小规模。全国数据约71TB筛选训练包、22TB embedding，应配0.5PB可用/1PB原始容量、节点NVMe缓存和至少2×200Gb/s互连。没有这些门，采购规模无法被审计。</w:t>
       </w:r>
     </w:p>
   </w:comment>
-  <w:comment w:id="11" w:author="Codex 审阅" w:date="2026-07-16T06:46:51+00:00">
+  <w:comment w:id="11" w:author="Codex 审阅" w:date="2026-07-16T06:49:21+00:00">
     <w:p>
       <w:r>
         <w:t>建议在首页增加一句定位：本项目借鉴 AlphaEarth 的“多源观测→统一 embedding→少标签下游制图”范式，但不是对官方模型的复刻或性能等价声明。官方公开产品是年度 10 m、64 维 embedding；本项目可突出中国数据源和月度更新能力。</w:t>
       </w:r>
     </w:p>
   </w:comment>
-  <w:comment w:id="12" w:author="Codex 审阅" w:date="2026-07-16T06:46:51+00:00">
+  <w:comment w:id="12" w:author="Codex 审阅" w:date="2026-07-16T06:49:21+00:00">
     <w:p>
       <w:r>
         <w:t>此行有明确逻辑矛盾：6/22 启动时的可用训练窗口为 122 天，表二给出的 5 m 训练需 161 天，仍超期 39 天，不能标为“可接受”。应改为不可行，或列出新增资源/不同训练配方的假设。</w:t>
       </w:r>
     </w:p>
   </w:comment>
-  <w:comment w:id="13" w:author="Codex 审阅" w:date="2026-07-16T06:46:51+00:00">
+  <w:comment w:id="13" w:author="Codex 审阅" w:date="2026-07-16T06:49:21+00:00">
     <w:p>
       <w:r>
         <w:t>表八称 76 天缩至 61 天后所需卡数由 128 增至 256；若其他条件不变，线性倍率仅为 76/61≈1.25。该表混用了不同芯片、不同配方或未说明裕量，必须按同一实测吞吐公式重算。</w:t>
       </w:r>
     </w:p>
   </w:comment>
-  <w:comment w:id="14" w:author="Codex 审阅" w:date="2026-07-16T06:46:51+00:00">
+  <w:comment w:id="14" w:author="Codex 审阅" w:date="2026-07-16T06:49:21+00:00">
     <w:p>
       <w:r>
         <w:t>1,280 到 1,664–2,816 的增幅为约 30%–120%，不是表中写的“30–55%”。更重要的是，当前数据只有约 3 m 高分光学/SAR，并不能验证全国 2 m 训练数据是否存在。</w:t>

</xml_diff>

<commit_message>
docs: inventory Haidian data and embedding storage
</commit_message>
<xml_diff>
--- a/docs/reviews/china_alpha_earth_three_plans_report_reviewed_20260716.docx
+++ b/docs/reviews/china_alpha_earth_three_plans_report_reviewed_20260716.docx
@@ -7,12 +7,12 @@
         <w:pStyle w:val="1"/>
       </w:pPr>
       <w:commentRangeStart w:id="11"/>
-      <w:del w:id="1" w:author="Codex 审阅" w:date="2026-07-16T06:49:21+00:00">
+      <w:del w:id="1" w:author="Codex 审阅" w:date="2026-07-16T06:58:58+00:00">
         <w:r>
           <w:delText>中国版Alpha Earth 三个落地方案</w:delText>
         </w:r>
       </w:del>
-      <w:ins w:id="2" w:author="Codex 审阅" w:date="2026-07-16T06:49:21+00:00">
+      <w:ins w:id="2" w:author="Codex 审阅" w:date="2026-07-16T06:58:58+00:00">
         <w:r>
           <w:t>中国版 AlphaEarth：10 m 国家级地球观测嵌入的分阶段建设方案</w:t>
         </w:r>
@@ -27,12 +27,12 @@
         <w:pStyle w:val="aa"/>
       </w:pPr>
       <w:commentRangeStart w:id="0"/>
-      <w:del w:id="3" w:author="Codex 审阅" w:date="2026-07-16T06:49:21+00:00">
+      <w:del w:id="3" w:author="Codex 审阅" w:date="2026-07-16T06:58:58+00:00">
         <w:r>
           <w:delText>现有资源：16张昇腾910B | DDL：2026年11月30日 | 启动日期：2026年8月1日</w:delText>
         </w:r>
       </w:del>
-      <w:ins w:id="4" w:author="Codex 审阅" w:date="2026-07-16T06:49:21+00:00">
+      <w:ins w:id="4" w:author="Codex 审阅" w:date="2026-07-16T06:58:58+00:00">
         <w:r>
           <w:t>拟可用资源：16 张昇腾 910B（须完成多节点 HCCL 拓扑、排期与稳定性验收；本项目已验证 6 卡并行） | 目标里程碑：2026 年 11 月 30 日 | 拟启动：2026 年 8 月 1 日</w:t>
         </w:r>
@@ -317,12 +317,12 @@
         <w:pStyle w:val="aa"/>
       </w:pPr>
       <w:commentRangeStart w:id="1"/>
-      <w:del w:id="5" w:author="Codex 审阅" w:date="2026-07-16T06:49:21+00:00">
+      <w:del w:id="5" w:author="Codex 审阅" w:date="2026-07-16T06:58:58+00:00">
         <w:r>
           <w:delText>资源不变，缩小范围，三档分辨率验证</w:delText>
         </w:r>
       </w:del>
-      <w:ins w:id="6" w:author="Codex 审阅" w:date="2026-07-16T06:49:21+00:00">
+      <w:ins w:id="6" w:author="Codex 审阅" w:date="2026-07-16T06:58:58+00:00">
         <w:r>
           <w:t>资源不变，先完成 10 m 多模态月度嵌入试点；5 m/2 m 仅在高分数据授权、覆盖和配准通过后作为区域增强验证</w:t>
         </w:r>
@@ -337,12 +337,12 @@
         <w:pStyle w:val="FirstParagraph"/>
       </w:pPr>
       <w:commentRangeStart w:id="2"/>
-      <w:del w:id="7" w:author="Codex 审阅" w:date="2026-07-16T06:49:21+00:00">
+      <w:del w:id="7" w:author="Codex 审阅" w:date="2026-07-16T06:58:58+00:00">
         <w:r>
           <w:delText>东北训练面积：80.8万km² × 30% = 24.2万km² | 可用训练窗口：107天</w:delText>
         </w:r>
       </w:del>
-      <w:ins w:id="8" w:author="Codex 审阅" w:date="2026-07-16T06:49:21+00:00">
+      <w:ins w:id="8" w:author="Codex 审阅" w:date="2026-07-16T06:58:58+00:00">
         <w:r>
           <w:t>东北训练范围：80.8 万 km² × 30% = 24.2 万 km²；须说明 30% 的分层抽样规则、覆盖生态区和每月有效观测阈值 | 名义训练窗口：107 天</w:t>
         </w:r>
@@ -654,12 +654,12 @@
         <w:pStyle w:val="a0"/>
       </w:pPr>
       <w:commentRangeStart w:id="3"/>
-      <w:del w:id="9" w:author="Codex 审阅" w:date="2026-07-16T06:49:21+00:00">
+      <w:del w:id="9" w:author="Codex 审阅" w:date="2026-07-16T06:58:58+00:00">
         <w:r>
           <w:delText>建议：优先做10m东北底座，22天即可完成，作为团队技术验证和首版成果。</w:delText>
         </w:r>
       </w:del>
-      <w:ins w:id="10" w:author="Codex 审阅" w:date="2026-07-16T06:49:21+00:00">
+      <w:ins w:id="10" w:author="Codex 审阅" w:date="2026-07-16T06:58:58+00:00">
         <w:r>
           <w:t>建议：优先建设 10 m 东北试点底座，先用固定优化步数的 1,000-step 吞吐基准和数据就绪率复算工期，再作为团队技术验证与首版成果。</w:t>
         </w:r>
@@ -946,12 +946,12 @@
               <w:pStyle w:val="Compact"/>
             </w:pPr>
             <w:commentRangeStart w:id="8"/>
-            <w:del w:id="19" w:author="Codex 审阅" w:date="2026-07-16T06:49:21+00:00">
+            <w:del w:id="19" w:author="Codex 审阅" w:date="2026-07-16T06:58:58+00:00">
               <w:r>
                 <w:delText>如需107天完成，需追加</w:delText>
               </w:r>
             </w:del>
-            <w:ins w:id="20" w:author="Codex 审阅" w:date="2026-07-16T06:49:21+00:00">
+            <w:ins w:id="20" w:author="Codex 审阅" w:date="2026-07-16T06:58:58+00:00">
               <w:r>
                 <w:t>如需 107 天完成（线性外推，未计多节点效率损失）</w:t>
               </w:r>
@@ -970,12 +970,12 @@
             <w:pPr>
               <w:pStyle w:val="Compact"/>
             </w:pPr>
-            <w:del w:id="21" w:author="Codex 审阅" w:date="2026-07-16T06:49:21+00:00">
+            <w:del w:id="21" w:author="Codex 审阅" w:date="2026-07-16T06:58:58+00:00">
               <w:r>
                 <w:delText>29卡910B（共45卡）</w:delText>
               </w:r>
             </w:del>
-            <w:ins w:id="22" w:author="Codex 审阅" w:date="2026-07-16T06:49:21+00:00">
+            <w:ins w:id="22" w:author="Codex 审阅" w:date="2026-07-16T06:58:58+00:00">
               <w:r>
                 <w:t>约需追加 24 张 910B（共 40 张）；最终数值须由固定步数吞吐基准复算</w:t>
               </w:r>
@@ -1053,12 +1053,12 @@
         <w:pStyle w:val="2"/>
       </w:pPr>
       <w:commentRangeStart w:id="10"/>
-      <w:del w:id="11" w:author="Codex 审阅" w:date="2026-07-16T06:49:21+00:00">
+      <w:del w:id="11" w:author="Codex 审阅" w:date="2026-07-16T06:58:58+00:00">
         <w:r>
           <w:delText>方案三：采购扩充算力，全国三档分辨率，61天DDL</w:delText>
         </w:r>
       </w:del>
-      <w:ins w:id="12" w:author="Codex 审阅" w:date="2026-07-16T06:49:21+00:00">
+      <w:ins w:id="12" w:author="Codex 审阅" w:date="2026-07-16T06:58:58+00:00">
         <w:r>
           <w:t>方案三：在通过数据与吞吐阶段门后扩充算力，建设全国 10 m 主底座；5 m/2 m 作为有授权高分数据支撑的区域增强路线</w:t>
         </w:r>
@@ -1073,12 +1073,12 @@
         <w:pStyle w:val="aa"/>
       </w:pPr>
       <w:commentRangeStart w:id="4"/>
-      <w:del w:id="13" w:author="Codex 审阅" w:date="2026-07-16T06:49:21+00:00">
+      <w:del w:id="13" w:author="Codex 审阅" w:date="2026-07-16T06:58:58+00:00">
         <w:r>
           <w:delText>可采购H100/H800/A100/A800/910C，10/1-11/30完成训练</w:delText>
         </w:r>
       </w:del>
-      <w:ins w:id="14" w:author="Codex 审阅" w:date="2026-07-16T06:49:21+00:00">
+      <w:ins w:id="14" w:author="Codex 审阅" w:date="2026-07-16T06:58:58+00:00">
         <w:r>
           <w:t>候选算力包括 910C 与合规可采购 GPU；10/1-11/30 仅作为目标训练窗口，须在前置数据就绪、集群网络、HCCL 扩展效率与 1,000-step 基准验收后确认</w:t>
         </w:r>
@@ -1153,12 +1153,12 @@
               <w:pStyle w:val="Compact"/>
             </w:pPr>
             <w:commentRangeStart w:id="5"/>
-            <w:del w:id="23" w:author="Codex 审阅" w:date="2026-07-16T06:49:21+00:00">
+            <w:del w:id="23" w:author="Codex 审阅" w:date="2026-07-16T06:58:58+00:00">
               <w:r>
                 <w:delText>有效算力</w:delText>
               </w:r>
             </w:del>
-            <w:ins w:id="24" w:author="Codex 审阅" w:date="2026-07-16T06:49:21+00:00">
+            <w:ins w:id="24" w:author="Codex 审阅" w:date="2026-07-16T06:58:58+00:00">
               <w:r>
                 <w:t>有效训练吞吐（待实测）</w:t>
               </w:r>
@@ -1853,12 +1853,12 @@
               <w:pStyle w:val="Compact"/>
             </w:pPr>
             <w:commentRangeStart w:id="6"/>
-            <w:del w:id="25" w:author="Codex 审阅" w:date="2026-07-16T06:49:21+00:00">
+            <w:del w:id="25" w:author="Codex 审阅" w:date="2026-07-16T06:58:58+00:00">
               <w:r>
                 <w:delText>单卡参考价</w:delText>
               </w:r>
             </w:del>
-            <w:ins w:id="26" w:author="Codex 审阅" w:date="2026-07-16T06:49:21+00:00">
+            <w:ins w:id="26" w:author="Codex 审阅" w:date="2026-07-16T06:58:58+00:00">
               <w:r>
                 <w:t>采购估算单价（须询价）</w:t>
               </w:r>
@@ -2773,12 +2773,12 @@
           <w:numId w:val="12"/>
         </w:numPr>
       </w:pPr>
-      <w:del w:id="15" w:author="Codex 审阅" w:date="2026-07-16T06:49:21+00:00">
+      <w:del w:id="15" w:author="Codex 审阅" w:date="2026-07-16T06:58:58+00:00">
         <w:r>
           <w:delText>10m/5m目标：910C即可满足，64-256卡，成本仅0.04-0.18亿，强烈推荐。</w:delText>
         </w:r>
       </w:del>
-      <w:ins w:id="16" w:author="Codex 审阅" w:date="2026-07-16T06:49:21+00:00">
+      <w:ins w:id="16" w:author="Codex 审阅" w:date="2026-07-16T06:58:58+00:00">
         <w:r>
           <w:t>10 m 目标：以实测吞吐、并行效率和全口径 TCO 为依据确定 910C 集群规模；5 m 只有在全国高分数据的授权、覆盖、时相与配准均满足时才进入预算评审。</w:t>
         </w:r>
@@ -2793,12 +2793,12 @@
         </w:numPr>
       </w:pPr>
       <w:commentRangeStart w:id="7"/>
-      <w:del w:id="17" w:author="Codex 审阅" w:date="2026-07-16T06:49:21+00:00">
+      <w:del w:id="17" w:author="Codex 审阅" w:date="2026-07-16T06:58:58+00:00">
         <w:r>
           <w:delText>2m目标：成本跃升至1.8-4.2亿，卡数需求1,600-2,800张。受8/1启动、61天训练窗口限制，卡数需求比6/22启动方案增加约60%。</w:delText>
         </w:r>
       </w:del>
-      <w:ins w:id="18" w:author="Codex 审阅" w:date="2026-07-16T06:49:21+00:00">
+      <w:ins w:id="18" w:author="Codex 审阅" w:date="2026-07-16T06:58:58+00:00">
         <w:r>
           <w:t>2 m 目标不应与全国 10 m 主预训练并列承诺：其主要瓶颈是高分数据授权与覆盖、存储和 I/O，而非单纯卡数；建议改为完成 10 m 主底座后的重点城市/行业区域增强路线。</w:t>
         </w:r>
@@ -4392,105 +4392,105 @@
 
 <file path=word/comments.xml><?xml version="1.0" encoding="utf-8"?>
 <w:comments xmlns:w="http://schemas.openxmlformats.org/wordprocessingml/2006/main">
-  <w:comment w:id="0" w:author="Codex 审阅" w:date="2026-07-16T06:49:21+00:00">
+  <w:comment w:id="0" w:author="Codex 审阅" w:date="2026-07-16T06:58:58+00:00">
     <w:p>
       <w:r>
         <w:t>资源口径需要拆开写：当前节点可见 8 张 910B4，项目已稳定验证 6 卡并行；P10C 海淀生产基线（320 patch、6 个月、800 epoch、每卡 batch=3、梯度累积=2）从 2026-07-04 16:53:29 至 2026-07-05 10:43:01 保存 epoch_800，实测 17 小时49分32秒。该时间包含验证/保存，不含导出和下游评测，且从 P9B 权重继续训练，不能写作从零预训练。“16 卡”若为两节点集群，须再写明节点数、HCCL 拓扑、网络带宽、可独占时段和故障替补策略。</w:t>
       </w:r>
     </w:p>
   </w:comment>
-  <w:comment w:id="1" w:author="Codex 审阅" w:date="2026-07-16T06:49:21+00:00">
+  <w:comment w:id="1" w:author="Codex 审阅" w:date="2026-07-16T06:58:58+00:00">
     <w:p>
       <w:r>
         <w:t>关键技术修改：Sentinel-2/Sentinel-1/Landsat 的原生空间信息不是 5 m 或 2 m。把全国主预训练直接改成 5 m/2 m 会把上采样当成新增信息。建议明确：10 m 是主 embedding 网格；高分光学/SAR 是稀疏辅助模态；5 m/2 m 仅依赖另行取得且可合法训练的高分数据。</w:t>
       </w:r>
     </w:p>
   </w:comment>
-  <w:comment w:id="2" w:author="Codex 审阅" w:date="2026-07-16T06:49:21+00:00">
+  <w:comment w:id="2" w:author="Codex 审阅" w:date="2026-07-16T06:58:58+00:00">
     <w:p>
       <w:r>
         <w:t>“30%”不能只是面积比例。需在附录列出分层：省份/生态区/土地覆盖/城乡梯度/云量带，并固定每月最小有效像素比例。否则训练集可能集中在易获取、低云区域，无法代表中国尺度泛化。</w:t>
       </w:r>
     </w:p>
   </w:comment>
-  <w:comment w:id="3" w:author="Codex 审阅" w:date="2026-07-16T06:49:21+00:00">
+  <w:comment w:id="3" w:author="Codex 审阅" w:date="2026-07-16T06:58:58+00:00">
     <w:p>
       <w:r>
         <w:t>请删去把“小数据 800 epoch”直接放大到全国的做法。P10C 海淀实测为 320×800=25.6 万 patch-visits，6 卡 17小时49分32秒，即 2,393.6 patch-visits/卡·小时；全国30%约175.8万 patch，若仍跑800 epoch，16卡完全线性也约需1,530天。样本规模改变后，epoch不是可比单位；应统一为优化步数、全局 batch、有效像素数、混合精度、数据读取命中率和实际 samples/s。先跑 1,000 step 基准，再得出卡数和 ETA。</w:t>
       </w:r>
     </w:p>
   </w:comment>
-  <w:comment w:id="4" w:author="Codex 审阅" w:date="2026-07-16T06:49:21+00:00">
+  <w:comment w:id="4" w:author="Codex 审阅" w:date="2026-07-16T06:58:58+00:00">
     <w:p>
       <w:r>
         <w:t>采购表要把“加速卡数量”改为“完整集群”：计算卡、节点 CPU/RAM、本地 NVMe 缓存、RoCE/IB 网络、对象存储、备份、运维和电力。全国数据训练常先被 I/O 限速，单卡 TFLOPS 不能直接推导完成天数。</w:t>
       </w:r>
     </w:p>
   </w:comment>
-  <w:comment w:id="5" w:author="Codex 审阅" w:date="2026-07-16T06:49:21+00:00">
+  <w:comment w:id="5" w:author="Codex 审阅" w:date="2026-07-16T06:58:58+00:00">
     <w:p>
       <w:r>
         <w:t>建议删除或弱化这一列的纯 TFLOPS 比较。不同卡的 BF16/FP16、算子、显存、通信、软件栈和数据管线不同；请改为同一训练脚本、同一全局 batch 下的实测 step/s、tokens/pixels/s 与 16/32/64 卡扩展效率。</w:t>
       </w:r>
     </w:p>
   </w:comment>
-  <w:comment w:id="6" w:author="Codex 审阅" w:date="2026-07-16T06:49:21+00:00">
+  <w:comment w:id="6" w:author="Codex 审阅" w:date="2026-07-16T06:58:58+00:00">
     <w:p>
       <w:r>
         <w:t>价格不能作为固定事实。补充“报价日期、含税/维保年限、服务器与网络是否包含、采购或租赁、交期、替代料”。尤其 H800/A800 的可得性与合规性需要供应商书面确认。</w:t>
       </w:r>
     </w:p>
   </w:comment>
-  <w:comment w:id="7" w:author="Codex 审阅" w:date="2026-07-16T06:49:21+00:00">
+  <w:comment w:id="7" w:author="Codex 审阅" w:date="2026-07-16T06:58:58+00:00">
     <w:p>
       <w:r>
-        <w:t>按当前项目 64 维、128×128、FP16 月度 embedding 的输出格式线性估算，30% 全国、6 个月的 10 m embedding 约 22 TB；5 m 约 88 TB；2 m 约 553 TB，尚未包括输入、临时缓存、版本和副本。因此 2 m 必须单列数据、存储和交付方案。</w:t>
+        <w:t>请按当前实际导出格式，而不是理论FP16格式估算：P10C 的 64维、128×128 embedding map 目前以 FP32 保存，海淀320 patch、6个月实测7.51GiB。线性外推30%全国、6个月，10 m约44 TB；5 m约177 TB；2 m约1.11 PB，尚未包括输入、临时缓存、版本和副本。验证FP16导出后才可将这些值约减半。因此 2 m 必须单列数据、存储和交付方案。</w:t>
       </w:r>
     </w:p>
   </w:comment>
-  <w:comment w:id="8" w:author="Codex 审阅" w:date="2026-07-16T06:49:21+00:00">
+  <w:comment w:id="8" w:author="Codex 审阅" w:date="2026-07-16T06:58:58+00:00">
     <w:p>
       <w:r>
         <w:t>原表存在算术不一致：265 天在 16 卡上的工作量若压缩到 107 天，线性比例为 265/107×16≈40 张，总追加约 24 张，不是 45 张总量。更重要的是，多节点通信损失会使线性估算偏乐观。</w:t>
       </w:r>
     </w:p>
   </w:comment>
-  <w:comment w:id="9" w:author="Codex 审阅" w:date="2026-07-16T06:49:21+00:00">
+  <w:comment w:id="9" w:author="Codex 审阅" w:date="2026-07-16T06:58:58+00:00">
     <w:p>
       <w:r>
         <w:t>请勿默认 910B 与 H 系列/A 系列可以混入同一个分布式训练作业并线性抵扣采购卡数。若不能完成混合 HCCL/NCCL 和算子兼容性压测，现有 910B 应单独承担数据预处理、评测、消融或独立训练。</w:t>
       </w:r>
     </w:p>
   </w:comment>
-  <w:comment w:id="10" w:author="Codex 审阅" w:date="2026-07-16T06:49:21+00:00">
+  <w:comment w:id="10" w:author="Codex 审阅" w:date="2026-07-16T06:58:58+00:00">
     <w:p>
       <w:r>
-        <w:t>建议新增“阶段门与验收指标”一页：G0 数据许可/覆盖/云质量通过；G1 10 万 patch 数据管线通过；G2 16→24→32 卡扩展效率验收；G3 跨区域轻量 probe 和少样本任务优于 raw/传统基线；G4 发布前独立标签与时相留出评测。以当前P10C实测速率估算，40万 updates 在16卡、70%效率下含20%缓冲约71.6天，61天窗口不足；24张同构卡、68%效率下约49.1天，建议作为该目标的最小规模。全国数据约71TB筛选训练包、22TB embedding，应配0.5PB可用/1PB原始容量、节点NVMe缓存和至少2×200Gb/s互连。没有这些门，采购规模无法被审计。</w:t>
+        <w:t>建议新增“阶段门与验收指标”一页：G0 数据许可/覆盖/云质量通过；G1 10 万 patch 数据管线通过；G2 16→24→32 卡扩展效率验收；G3 跨区域轻量 probe 和少样本任务优于 raw/传统基线；G4 发布前独立标签与时相留出评测。以当前P10C实测速率估算，40万 updates 在16卡、70%效率下含20%缓冲约71.6天，61天窗口不足；24张同构卡、68%效率下约49.1天，建议作为该目标的最小规模。全国数据约71TB筛选训练包、当前FP32导出约44TB embedding（验证FP16后约22TB），应配0.5PB可用/1PB原始容量、节点NVMe缓存和至少2×200Gb/s互连。没有这些门，采购规模无法被审计。</w:t>
       </w:r>
     </w:p>
   </w:comment>
-  <w:comment w:id="11" w:author="Codex 审阅" w:date="2026-07-16T06:49:21+00:00">
+  <w:comment w:id="11" w:author="Codex 审阅" w:date="2026-07-16T06:58:58+00:00">
     <w:p>
       <w:r>
         <w:t>建议在首页增加一句定位：本项目借鉴 AlphaEarth 的“多源观测→统一 embedding→少标签下游制图”范式，但不是对官方模型的复刻或性能等价声明。官方公开产品是年度 10 m、64 维 embedding；本项目可突出中国数据源和月度更新能力。</w:t>
       </w:r>
     </w:p>
   </w:comment>
-  <w:comment w:id="12" w:author="Codex 审阅" w:date="2026-07-16T06:49:21+00:00">
+  <w:comment w:id="12" w:author="Codex 审阅" w:date="2026-07-16T06:58:58+00:00">
     <w:p>
       <w:r>
         <w:t>此行有明确逻辑矛盾：6/22 启动时的可用训练窗口为 122 天，表二给出的 5 m 训练需 161 天，仍超期 39 天，不能标为“可接受”。应改为不可行，或列出新增资源/不同训练配方的假设。</w:t>
       </w:r>
     </w:p>
   </w:comment>
-  <w:comment w:id="13" w:author="Codex 审阅" w:date="2026-07-16T06:49:21+00:00">
+  <w:comment w:id="13" w:author="Codex 审阅" w:date="2026-07-16T06:58:58+00:00">
     <w:p>
       <w:r>
         <w:t>表八称 76 天缩至 61 天后所需卡数由 128 增至 256；若其他条件不变，线性倍率仅为 76/61≈1.25。该表混用了不同芯片、不同配方或未说明裕量，必须按同一实测吞吐公式重算。</w:t>
       </w:r>
     </w:p>
   </w:comment>
-  <w:comment w:id="14" w:author="Codex 审阅" w:date="2026-07-16T06:49:21+00:00">
+  <w:comment w:id="14" w:author="Codex 审阅" w:date="2026-07-16T06:58:58+00:00">
     <w:p>
       <w:r>
         <w:t>1,280 到 1,664–2,816 的增幅为约 30%–120%，不是表中写的“30–55%”。更重要的是，当前数据只有约 3 m 高分光学/SAR，并不能验证全国 2 m 训练数据是否存在。</w:t>

</xml_diff>

<commit_message>
docs: add AlphaEarth scale reference table
</commit_message>
<xml_diff>
--- a/docs/reviews/china_alpha_earth_three_plans_report_reviewed_20260716.docx
+++ b/docs/reviews/china_alpha_earth_three_plans_report_reviewed_20260716.docx
@@ -7,12 +7,12 @@
         <w:pStyle w:val="1"/>
       </w:pPr>
       <w:commentRangeStart w:id="11"/>
-      <w:del w:id="1" w:author="Codex 审阅" w:date="2026-07-16T06:58:58+00:00">
+      <w:del w:id="1" w:author="Codex 审阅" w:date="2026-07-16T07:07:36+00:00">
         <w:r>
           <w:delText>中国版Alpha Earth 三个落地方案</w:delText>
         </w:r>
       </w:del>
-      <w:ins w:id="2" w:author="Codex 审阅" w:date="2026-07-16T06:58:58+00:00">
+      <w:ins w:id="2" w:author="Codex 审阅" w:date="2026-07-16T07:07:36+00:00">
         <w:r>
           <w:t>中国版 AlphaEarth：10 m 国家级地球观测嵌入的分阶段建设方案</w:t>
         </w:r>
@@ -27,12 +27,12 @@
         <w:pStyle w:val="aa"/>
       </w:pPr>
       <w:commentRangeStart w:id="0"/>
-      <w:del w:id="3" w:author="Codex 审阅" w:date="2026-07-16T06:58:58+00:00">
+      <w:del w:id="3" w:author="Codex 审阅" w:date="2026-07-16T07:07:36+00:00">
         <w:r>
           <w:delText>现有资源：16张昇腾910B | DDL：2026年11月30日 | 启动日期：2026年8月1日</w:delText>
         </w:r>
       </w:del>
-      <w:ins w:id="4" w:author="Codex 审阅" w:date="2026-07-16T06:58:58+00:00">
+      <w:ins w:id="4" w:author="Codex 审阅" w:date="2026-07-16T07:07:36+00:00">
         <w:r>
           <w:t>拟可用资源：16 张昇腾 910B（须完成多节点 HCCL 拓扑、排期与稳定性验收；本项目已验证 6 卡并行） | 目标里程碑：2026 年 11 月 30 日 | 拟启动：2026 年 8 月 1 日</w:t>
         </w:r>
@@ -317,12 +317,12 @@
         <w:pStyle w:val="aa"/>
       </w:pPr>
       <w:commentRangeStart w:id="1"/>
-      <w:del w:id="5" w:author="Codex 审阅" w:date="2026-07-16T06:58:58+00:00">
+      <w:del w:id="5" w:author="Codex 审阅" w:date="2026-07-16T07:07:36+00:00">
         <w:r>
           <w:delText>资源不变，缩小范围，三档分辨率验证</w:delText>
         </w:r>
       </w:del>
-      <w:ins w:id="6" w:author="Codex 审阅" w:date="2026-07-16T06:58:58+00:00">
+      <w:ins w:id="6" w:author="Codex 审阅" w:date="2026-07-16T07:07:36+00:00">
         <w:r>
           <w:t>资源不变，先完成 10 m 多模态月度嵌入试点；5 m/2 m 仅在高分数据授权、覆盖和配准通过后作为区域增强验证</w:t>
         </w:r>
@@ -337,12 +337,12 @@
         <w:pStyle w:val="FirstParagraph"/>
       </w:pPr>
       <w:commentRangeStart w:id="2"/>
-      <w:del w:id="7" w:author="Codex 审阅" w:date="2026-07-16T06:58:58+00:00">
+      <w:del w:id="7" w:author="Codex 审阅" w:date="2026-07-16T07:07:36+00:00">
         <w:r>
           <w:delText>东北训练面积：80.8万km² × 30% = 24.2万km² | 可用训练窗口：107天</w:delText>
         </w:r>
       </w:del>
-      <w:ins w:id="8" w:author="Codex 审阅" w:date="2026-07-16T06:58:58+00:00">
+      <w:ins w:id="8" w:author="Codex 审阅" w:date="2026-07-16T07:07:36+00:00">
         <w:r>
           <w:t>东北训练范围：80.8 万 km² × 30% = 24.2 万 km²；须说明 30% 的分层抽样规则、覆盖生态区和每月有效观测阈值 | 名义训练窗口：107 天</w:t>
         </w:r>
@@ -654,12 +654,12 @@
         <w:pStyle w:val="a0"/>
       </w:pPr>
       <w:commentRangeStart w:id="3"/>
-      <w:del w:id="9" w:author="Codex 审阅" w:date="2026-07-16T06:58:58+00:00">
+      <w:del w:id="9" w:author="Codex 审阅" w:date="2026-07-16T07:07:36+00:00">
         <w:r>
           <w:delText>建议：优先做10m东北底座，22天即可完成，作为团队技术验证和首版成果。</w:delText>
         </w:r>
       </w:del>
-      <w:ins w:id="10" w:author="Codex 审阅" w:date="2026-07-16T06:58:58+00:00">
+      <w:ins w:id="10" w:author="Codex 审阅" w:date="2026-07-16T07:07:36+00:00">
         <w:r>
           <w:t>建议：优先建设 10 m 东北试点底座，先用固定优化步数的 1,000-step 吞吐基准和数据就绪率复算工期，再作为团队技术验证与首版成果。</w:t>
         </w:r>
@@ -946,12 +946,12 @@
               <w:pStyle w:val="Compact"/>
             </w:pPr>
             <w:commentRangeStart w:id="8"/>
-            <w:del w:id="19" w:author="Codex 审阅" w:date="2026-07-16T06:58:58+00:00">
+            <w:del w:id="19" w:author="Codex 审阅" w:date="2026-07-16T07:07:36+00:00">
               <w:r>
                 <w:delText>如需107天完成，需追加</w:delText>
               </w:r>
             </w:del>
-            <w:ins w:id="20" w:author="Codex 审阅" w:date="2026-07-16T06:58:58+00:00">
+            <w:ins w:id="20" w:author="Codex 审阅" w:date="2026-07-16T07:07:36+00:00">
               <w:r>
                 <w:t>如需 107 天完成（线性外推，未计多节点效率损失）</w:t>
               </w:r>
@@ -970,12 +970,12 @@
             <w:pPr>
               <w:pStyle w:val="Compact"/>
             </w:pPr>
-            <w:del w:id="21" w:author="Codex 审阅" w:date="2026-07-16T06:58:58+00:00">
+            <w:del w:id="21" w:author="Codex 审阅" w:date="2026-07-16T07:07:36+00:00">
               <w:r>
                 <w:delText>29卡910B（共45卡）</w:delText>
               </w:r>
             </w:del>
-            <w:ins w:id="22" w:author="Codex 审阅" w:date="2026-07-16T06:58:58+00:00">
+            <w:ins w:id="22" w:author="Codex 审阅" w:date="2026-07-16T07:07:36+00:00">
               <w:r>
                 <w:t>约需追加 24 张 910B（共 40 张）；最终数值须由固定步数吞吐基准复算</w:t>
               </w:r>
@@ -1053,12 +1053,12 @@
         <w:pStyle w:val="2"/>
       </w:pPr>
       <w:commentRangeStart w:id="10"/>
-      <w:del w:id="11" w:author="Codex 审阅" w:date="2026-07-16T06:58:58+00:00">
+      <w:del w:id="11" w:author="Codex 审阅" w:date="2026-07-16T07:07:36+00:00">
         <w:r>
           <w:delText>方案三：采购扩充算力，全国三档分辨率，61天DDL</w:delText>
         </w:r>
       </w:del>
-      <w:ins w:id="12" w:author="Codex 审阅" w:date="2026-07-16T06:58:58+00:00">
+      <w:ins w:id="12" w:author="Codex 审阅" w:date="2026-07-16T07:07:36+00:00">
         <w:r>
           <w:t>方案三：在通过数据与吞吐阶段门后扩充算力，建设全国 10 m 主底座；5 m/2 m 作为有授权高分数据支撑的区域增强路线</w:t>
         </w:r>
@@ -1073,12 +1073,12 @@
         <w:pStyle w:val="aa"/>
       </w:pPr>
       <w:commentRangeStart w:id="4"/>
-      <w:del w:id="13" w:author="Codex 审阅" w:date="2026-07-16T06:58:58+00:00">
+      <w:del w:id="13" w:author="Codex 审阅" w:date="2026-07-16T07:07:36+00:00">
         <w:r>
           <w:delText>可采购H100/H800/A100/A800/910C，10/1-11/30完成训练</w:delText>
         </w:r>
       </w:del>
-      <w:ins w:id="14" w:author="Codex 审阅" w:date="2026-07-16T06:58:58+00:00">
+      <w:ins w:id="14" w:author="Codex 审阅" w:date="2026-07-16T07:07:36+00:00">
         <w:r>
           <w:t>候选算力包括 910C 与合规可采购 GPU；10/1-11/30 仅作为目标训练窗口，须在前置数据就绪、集群网络、HCCL 扩展效率与 1,000-step 基准验收后确认</w:t>
         </w:r>
@@ -1153,12 +1153,12 @@
               <w:pStyle w:val="Compact"/>
             </w:pPr>
             <w:commentRangeStart w:id="5"/>
-            <w:del w:id="23" w:author="Codex 审阅" w:date="2026-07-16T06:58:58+00:00">
+            <w:del w:id="23" w:author="Codex 审阅" w:date="2026-07-16T07:07:36+00:00">
               <w:r>
                 <w:delText>有效算力</w:delText>
               </w:r>
             </w:del>
-            <w:ins w:id="24" w:author="Codex 审阅" w:date="2026-07-16T06:58:58+00:00">
+            <w:ins w:id="24" w:author="Codex 审阅" w:date="2026-07-16T07:07:36+00:00">
               <w:r>
                 <w:t>有效训练吞吐（待实测）</w:t>
               </w:r>
@@ -1853,12 +1853,12 @@
               <w:pStyle w:val="Compact"/>
             </w:pPr>
             <w:commentRangeStart w:id="6"/>
-            <w:del w:id="25" w:author="Codex 审阅" w:date="2026-07-16T06:58:58+00:00">
+            <w:del w:id="25" w:author="Codex 审阅" w:date="2026-07-16T07:07:36+00:00">
               <w:r>
                 <w:delText>单卡参考价</w:delText>
               </w:r>
             </w:del>
-            <w:ins w:id="26" w:author="Codex 审阅" w:date="2026-07-16T06:58:58+00:00">
+            <w:ins w:id="26" w:author="Codex 审阅" w:date="2026-07-16T07:07:36+00:00">
               <w:r>
                 <w:t>采购估算单价（须询价）</w:t>
               </w:r>
@@ -2773,12 +2773,12 @@
           <w:numId w:val="12"/>
         </w:numPr>
       </w:pPr>
-      <w:del w:id="15" w:author="Codex 审阅" w:date="2026-07-16T06:58:58+00:00">
+      <w:del w:id="15" w:author="Codex 审阅" w:date="2026-07-16T07:07:36+00:00">
         <w:r>
           <w:delText>10m/5m目标：910C即可满足，64-256卡，成本仅0.04-0.18亿，强烈推荐。</w:delText>
         </w:r>
       </w:del>
-      <w:ins w:id="16" w:author="Codex 审阅" w:date="2026-07-16T06:58:58+00:00">
+      <w:ins w:id="16" w:author="Codex 审阅" w:date="2026-07-16T07:07:36+00:00">
         <w:r>
           <w:t>10 m 目标：以实测吞吐、并行效率和全口径 TCO 为依据确定 910C 集群规模；5 m 只有在全国高分数据的授权、覆盖、时相与配准均满足时才进入预算评审。</w:t>
         </w:r>
@@ -2793,12 +2793,12 @@
         </w:numPr>
       </w:pPr>
       <w:commentRangeStart w:id="7"/>
-      <w:del w:id="17" w:author="Codex 审阅" w:date="2026-07-16T06:58:58+00:00">
+      <w:del w:id="17" w:author="Codex 审阅" w:date="2026-07-16T07:07:36+00:00">
         <w:r>
           <w:delText>2m目标：成本跃升至1.8-4.2亿，卡数需求1,600-2,800张。受8/1启动、61天训练窗口限制，卡数需求比6/22启动方案增加约60%。</w:delText>
         </w:r>
       </w:del>
-      <w:ins w:id="18" w:author="Codex 审阅" w:date="2026-07-16T06:58:58+00:00">
+      <w:ins w:id="18" w:author="Codex 审阅" w:date="2026-07-16T07:07:36+00:00">
         <w:r>
           <w:t>2 m 目标不应与全国 10 m 主预训练并列承诺：其主要瓶颈是高分数据授权与覆盖、存储和 I/O，而非单纯卡数；建议改为完成 10 m 主底座后的重点城市/行业区域增强路线。</w:t>
         </w:r>
@@ -4392,105 +4392,105 @@
 
 <file path=word/comments.xml><?xml version="1.0" encoding="utf-8"?>
 <w:comments xmlns:w="http://schemas.openxmlformats.org/wordprocessingml/2006/main">
-  <w:comment w:id="0" w:author="Codex 审阅" w:date="2026-07-16T06:58:58+00:00">
+  <w:comment w:id="0" w:author="Codex 审阅" w:date="2026-07-16T07:07:36+00:00">
     <w:p>
       <w:r>
         <w:t>资源口径需要拆开写：当前节点可见 8 张 910B4，项目已稳定验证 6 卡并行；P10C 海淀生产基线（320 patch、6 个月、800 epoch、每卡 batch=3、梯度累积=2）从 2026-07-04 16:53:29 至 2026-07-05 10:43:01 保存 epoch_800，实测 17 小时49分32秒。该时间包含验证/保存，不含导出和下游评测，且从 P9B 权重继续训练，不能写作从零预训练。“16 卡”若为两节点集群，须再写明节点数、HCCL 拓扑、网络带宽、可独占时段和故障替补策略。</w:t>
       </w:r>
     </w:p>
   </w:comment>
-  <w:comment w:id="1" w:author="Codex 审阅" w:date="2026-07-16T06:58:58+00:00">
+  <w:comment w:id="1" w:author="Codex 审阅" w:date="2026-07-16T07:07:36+00:00">
     <w:p>
       <w:r>
         <w:t>关键技术修改：Sentinel-2/Sentinel-1/Landsat 的原生空间信息不是 5 m 或 2 m。把全国主预训练直接改成 5 m/2 m 会把上采样当成新增信息。建议明确：10 m 是主 embedding 网格；高分光学/SAR 是稀疏辅助模态；5 m/2 m 仅依赖另行取得且可合法训练的高分数据。</w:t>
       </w:r>
     </w:p>
   </w:comment>
-  <w:comment w:id="2" w:author="Codex 审阅" w:date="2026-07-16T06:58:58+00:00">
+  <w:comment w:id="2" w:author="Codex 审阅" w:date="2026-07-16T07:07:36+00:00">
     <w:p>
       <w:r>
         <w:t>“30%”不能只是面积比例。需在附录列出分层：省份/生态区/土地覆盖/城乡梯度/云量带，并固定每月最小有效像素比例。否则训练集可能集中在易获取、低云区域，无法代表中国尺度泛化。</w:t>
       </w:r>
     </w:p>
   </w:comment>
-  <w:comment w:id="3" w:author="Codex 审阅" w:date="2026-07-16T06:58:58+00:00">
+  <w:comment w:id="3" w:author="Codex 审阅" w:date="2026-07-16T07:07:36+00:00">
     <w:p>
       <w:r>
         <w:t>请删去把“小数据 800 epoch”直接放大到全国的做法。P10C 海淀实测为 320×800=25.6 万 patch-visits，6 卡 17小时49分32秒，即 2,393.6 patch-visits/卡·小时；全国30%约175.8万 patch，若仍跑800 epoch，16卡完全线性也约需1,530天。样本规模改变后，epoch不是可比单位；应统一为优化步数、全局 batch、有效像素数、混合精度、数据读取命中率和实际 samples/s。先跑 1,000 step 基准，再得出卡数和 ETA。</w:t>
       </w:r>
     </w:p>
   </w:comment>
-  <w:comment w:id="4" w:author="Codex 审阅" w:date="2026-07-16T06:58:58+00:00">
+  <w:comment w:id="4" w:author="Codex 审阅" w:date="2026-07-16T07:07:36+00:00">
     <w:p>
       <w:r>
         <w:t>采购表要把“加速卡数量”改为“完整集群”：计算卡、节点 CPU/RAM、本地 NVMe 缓存、RoCE/IB 网络、对象存储、备份、运维和电力。全国数据训练常先被 I/O 限速，单卡 TFLOPS 不能直接推导完成天数。</w:t>
       </w:r>
     </w:p>
   </w:comment>
-  <w:comment w:id="5" w:author="Codex 审阅" w:date="2026-07-16T06:58:58+00:00">
+  <w:comment w:id="5" w:author="Codex 审阅" w:date="2026-07-16T07:07:36+00:00">
     <w:p>
       <w:r>
         <w:t>建议删除或弱化这一列的纯 TFLOPS 比较。不同卡的 BF16/FP16、算子、显存、通信、软件栈和数据管线不同；请改为同一训练脚本、同一全局 batch 下的实测 step/s、tokens/pixels/s 与 16/32/64 卡扩展效率。</w:t>
       </w:r>
     </w:p>
   </w:comment>
-  <w:comment w:id="6" w:author="Codex 审阅" w:date="2026-07-16T06:58:58+00:00">
+  <w:comment w:id="6" w:author="Codex 审阅" w:date="2026-07-16T07:07:36+00:00">
     <w:p>
       <w:r>
         <w:t>价格不能作为固定事实。补充“报价日期、含税/维保年限、服务器与网络是否包含、采购或租赁、交期、替代料”。尤其 H800/A800 的可得性与合规性需要供应商书面确认。</w:t>
       </w:r>
     </w:p>
   </w:comment>
-  <w:comment w:id="7" w:author="Codex 审阅" w:date="2026-07-16T06:58:58+00:00">
+  <w:comment w:id="7" w:author="Codex 审阅" w:date="2026-07-16T07:07:36+00:00">
     <w:p>
       <w:r>
         <w:t>请按当前实际导出格式，而不是理论FP16格式估算：P10C 的 64维、128×128 embedding map 目前以 FP32 保存，海淀320 patch、6个月实测7.51GiB。线性外推30%全国、6个月，10 m约44 TB；5 m约177 TB；2 m约1.11 PB，尚未包括输入、临时缓存、版本和副本。验证FP16导出后才可将这些值约减半。因此 2 m 必须单列数据、存储和交付方案。</w:t>
       </w:r>
     </w:p>
   </w:comment>
-  <w:comment w:id="8" w:author="Codex 审阅" w:date="2026-07-16T06:58:58+00:00">
+  <w:comment w:id="8" w:author="Codex 审阅" w:date="2026-07-16T07:07:36+00:00">
     <w:p>
       <w:r>
         <w:t>原表存在算术不一致：265 天在 16 卡上的工作量若压缩到 107 天，线性比例为 265/107×16≈40 张，总追加约 24 张，不是 45 张总量。更重要的是，多节点通信损失会使线性估算偏乐观。</w:t>
       </w:r>
     </w:p>
   </w:comment>
-  <w:comment w:id="9" w:author="Codex 审阅" w:date="2026-07-16T06:58:58+00:00">
+  <w:comment w:id="9" w:author="Codex 审阅" w:date="2026-07-16T07:07:36+00:00">
     <w:p>
       <w:r>
         <w:t>请勿默认 910B 与 H 系列/A 系列可以混入同一个分布式训练作业并线性抵扣采购卡数。若不能完成混合 HCCL/NCCL 和算子兼容性压测，现有 910B 应单独承担数据预处理、评测、消融或独立训练。</w:t>
       </w:r>
     </w:p>
   </w:comment>
-  <w:comment w:id="10" w:author="Codex 审阅" w:date="2026-07-16T06:58:58+00:00">
+  <w:comment w:id="10" w:author="Codex 审阅" w:date="2026-07-16T07:07:36+00:00">
     <w:p>
       <w:r>
         <w:t>建议新增“阶段门与验收指标”一页：G0 数据许可/覆盖/云质量通过；G1 10 万 patch 数据管线通过；G2 16→24→32 卡扩展效率验收；G3 跨区域轻量 probe 和少样本任务优于 raw/传统基线；G4 发布前独立标签与时相留出评测。以当前P10C实测速率估算，40万 updates 在16卡、70%效率下含20%缓冲约71.6天，61天窗口不足；24张同构卡、68%效率下约49.1天，建议作为该目标的最小规模。全国数据约71TB筛选训练包、当前FP32导出约44TB embedding（验证FP16后约22TB），应配0.5PB可用/1PB原始容量、节点NVMe缓存和至少2×200Gb/s互连。没有这些门，采购规模无法被审计。</w:t>
       </w:r>
     </w:p>
   </w:comment>
-  <w:comment w:id="11" w:author="Codex 审阅" w:date="2026-07-16T06:58:58+00:00">
+  <w:comment w:id="11" w:author="Codex 审阅" w:date="2026-07-16T07:07:36+00:00">
     <w:p>
       <w:r>
-        <w:t>建议在首页增加一句定位：本项目借鉴 AlphaEarth 的“多源观测→统一 embedding→少标签下游制图”范式，但不是对官方模型的复刻或性能等价声明。官方公开产品是年度 10 m、64 维 embedding；本项目可突出中国数据源和月度更新能力。</w:t>
+        <w:t>建议在首页增加一句定位：本项目借鉴 AlphaEarth 的“多源观测→统一 embedding→少标签下游制图”范式，但不是对官方模型的复刻或性能等价声明。AEF公开训练使用512 TPU v4、56小时、10万步，发布年度10m、64维、8-bit量化embedding；其训练原始数据与发布桶的总存储均未公开。本文可突出中国数据源和月度更新能力，但需单独核算月度数据质量和FP32/FP16/8-bit发布格式的存储成本。</w:t>
       </w:r>
     </w:p>
   </w:comment>
-  <w:comment w:id="12" w:author="Codex 审阅" w:date="2026-07-16T06:58:58+00:00">
+  <w:comment w:id="12" w:author="Codex 审阅" w:date="2026-07-16T07:07:36+00:00">
     <w:p>
       <w:r>
         <w:t>此行有明确逻辑矛盾：6/22 启动时的可用训练窗口为 122 天，表二给出的 5 m 训练需 161 天，仍超期 39 天，不能标为“可接受”。应改为不可行，或列出新增资源/不同训练配方的假设。</w:t>
       </w:r>
     </w:p>
   </w:comment>
-  <w:comment w:id="13" w:author="Codex 审阅" w:date="2026-07-16T06:58:58+00:00">
+  <w:comment w:id="13" w:author="Codex 审阅" w:date="2026-07-16T07:07:36+00:00">
     <w:p>
       <w:r>
         <w:t>表八称 76 天缩至 61 天后所需卡数由 128 增至 256；若其他条件不变，线性倍率仅为 76/61≈1.25。该表混用了不同芯片、不同配方或未说明裕量，必须按同一实测吞吐公式重算。</w:t>
       </w:r>
     </w:p>
   </w:comment>
-  <w:comment w:id="14" w:author="Codex 审阅" w:date="2026-07-16T06:58:58+00:00">
+  <w:comment w:id="14" w:author="Codex 审阅" w:date="2026-07-16T07:07:36+00:00">
     <w:p>
       <w:r>
         <w:t>1,280 到 1,664–2,816 的增幅为约 30%–120%，不是表中写的“30–55%”。更重要的是，当前数据只有约 3 m 高分光学/SAR，并不能验证全国 2 m 训练数据是否存在。</w:t>

</xml_diff>

<commit_message>
docs: clarify 1 percent spatial sampling plan
</commit_message>
<xml_diff>
--- a/docs/reviews/china_alpha_earth_three_plans_report_reviewed_20260716.docx
+++ b/docs/reviews/china_alpha_earth_three_plans_report_reviewed_20260716.docx
@@ -7,12 +7,12 @@
         <w:pStyle w:val="1"/>
       </w:pPr>
       <w:commentRangeStart w:id="11"/>
-      <w:del w:id="1" w:author="Codex 审阅" w:date="2026-07-16T07:07:36+00:00">
+      <w:del w:id="1" w:author="Codex 审阅" w:date="2026-07-16T07:20:40+00:00">
         <w:r>
           <w:delText>中国版Alpha Earth 三个落地方案</w:delText>
         </w:r>
       </w:del>
-      <w:ins w:id="2" w:author="Codex 审阅" w:date="2026-07-16T07:07:36+00:00">
+      <w:ins w:id="2" w:author="Codex 审阅" w:date="2026-07-16T07:20:40+00:00">
         <w:r>
           <w:t>中国版 AlphaEarth：10 m 国家级地球观测嵌入的分阶段建设方案</w:t>
         </w:r>
@@ -27,12 +27,12 @@
         <w:pStyle w:val="aa"/>
       </w:pPr>
       <w:commentRangeStart w:id="0"/>
-      <w:del w:id="3" w:author="Codex 审阅" w:date="2026-07-16T07:07:36+00:00">
+      <w:del w:id="3" w:author="Codex 审阅" w:date="2026-07-16T07:20:40+00:00">
         <w:r>
           <w:delText>现有资源：16张昇腾910B | DDL：2026年11月30日 | 启动日期：2026年8月1日</w:delText>
         </w:r>
       </w:del>
-      <w:ins w:id="4" w:author="Codex 审阅" w:date="2026-07-16T07:07:36+00:00">
+      <w:ins w:id="4" w:author="Codex 审阅" w:date="2026-07-16T07:20:40+00:00">
         <w:r>
           <w:t>拟可用资源：16 张昇腾 910B（须完成多节点 HCCL 拓扑、排期与稳定性验收；本项目已验证 6 卡并行） | 目标里程碑：2026 年 11 月 30 日 | 拟启动：2026 年 8 月 1 日</w:t>
         </w:r>
@@ -317,12 +317,12 @@
         <w:pStyle w:val="aa"/>
       </w:pPr>
       <w:commentRangeStart w:id="1"/>
-      <w:del w:id="5" w:author="Codex 审阅" w:date="2026-07-16T07:07:36+00:00">
+      <w:del w:id="5" w:author="Codex 审阅" w:date="2026-07-16T07:20:40+00:00">
         <w:r>
           <w:delText>资源不变，缩小范围，三档分辨率验证</w:delText>
         </w:r>
       </w:del>
-      <w:ins w:id="6" w:author="Codex 审阅" w:date="2026-07-16T07:07:36+00:00">
+      <w:ins w:id="6" w:author="Codex 审阅" w:date="2026-07-16T07:20:40+00:00">
         <w:r>
           <w:t>资源不变，先完成 10 m 多模态月度嵌入试点；5 m/2 m 仅在高分数据授权、覆盖和配准通过后作为区域增强验证</w:t>
         </w:r>
@@ -337,12 +337,12 @@
         <w:pStyle w:val="FirstParagraph"/>
       </w:pPr>
       <w:commentRangeStart w:id="2"/>
-      <w:del w:id="7" w:author="Codex 审阅" w:date="2026-07-16T07:07:36+00:00">
+      <w:del w:id="7" w:author="Codex 审阅" w:date="2026-07-16T07:20:40+00:00">
         <w:r>
           <w:delText>东北训练面积：80.8万km² × 30% = 24.2万km² | 可用训练窗口：107天</w:delText>
         </w:r>
       </w:del>
-      <w:ins w:id="8" w:author="Codex 审阅" w:date="2026-07-16T07:07:36+00:00">
+      <w:ins w:id="8" w:author="Codex 审阅" w:date="2026-07-16T07:20:40+00:00">
         <w:r>
           <w:t>东北训练范围：80.8 万 km² × 30% = 24.2 万 km²；须说明 30% 的分层抽样规则、覆盖生态区和每月有效观测阈值 | 名义训练窗口：107 天</w:t>
         </w:r>
@@ -654,12 +654,12 @@
         <w:pStyle w:val="a0"/>
       </w:pPr>
       <w:commentRangeStart w:id="3"/>
-      <w:del w:id="9" w:author="Codex 审阅" w:date="2026-07-16T07:07:36+00:00">
+      <w:del w:id="9" w:author="Codex 审阅" w:date="2026-07-16T07:20:40+00:00">
         <w:r>
           <w:delText>建议：优先做10m东北底座，22天即可完成，作为团队技术验证和首版成果。</w:delText>
         </w:r>
       </w:del>
-      <w:ins w:id="10" w:author="Codex 审阅" w:date="2026-07-16T07:07:36+00:00">
+      <w:ins w:id="10" w:author="Codex 审阅" w:date="2026-07-16T07:20:40+00:00">
         <w:r>
           <w:t>建议：优先建设 10 m 东北试点底座，先用固定优化步数的 1,000-step 吞吐基准和数据就绪率复算工期，再作为团队技术验证与首版成果。</w:t>
         </w:r>
@@ -946,12 +946,12 @@
               <w:pStyle w:val="Compact"/>
             </w:pPr>
             <w:commentRangeStart w:id="8"/>
-            <w:del w:id="19" w:author="Codex 审阅" w:date="2026-07-16T07:07:36+00:00">
+            <w:del w:id="19" w:author="Codex 审阅" w:date="2026-07-16T07:20:40+00:00">
               <w:r>
                 <w:delText>如需107天完成，需追加</w:delText>
               </w:r>
             </w:del>
-            <w:ins w:id="20" w:author="Codex 审阅" w:date="2026-07-16T07:07:36+00:00">
+            <w:ins w:id="20" w:author="Codex 审阅" w:date="2026-07-16T07:20:40+00:00">
               <w:r>
                 <w:t>如需 107 天完成（线性外推，未计多节点效率损失）</w:t>
               </w:r>
@@ -970,12 +970,12 @@
             <w:pPr>
               <w:pStyle w:val="Compact"/>
             </w:pPr>
-            <w:del w:id="21" w:author="Codex 审阅" w:date="2026-07-16T07:07:36+00:00">
+            <w:del w:id="21" w:author="Codex 审阅" w:date="2026-07-16T07:20:40+00:00">
               <w:r>
                 <w:delText>29卡910B（共45卡）</w:delText>
               </w:r>
             </w:del>
-            <w:ins w:id="22" w:author="Codex 审阅" w:date="2026-07-16T07:07:36+00:00">
+            <w:ins w:id="22" w:author="Codex 审阅" w:date="2026-07-16T07:20:40+00:00">
               <w:r>
                 <w:t>约需追加 24 张 910B（共 40 张）；最终数值须由固定步数吞吐基准复算</w:t>
               </w:r>
@@ -1053,12 +1053,12 @@
         <w:pStyle w:val="2"/>
       </w:pPr>
       <w:commentRangeStart w:id="10"/>
-      <w:del w:id="11" w:author="Codex 审阅" w:date="2026-07-16T07:07:36+00:00">
+      <w:del w:id="11" w:author="Codex 审阅" w:date="2026-07-16T07:20:40+00:00">
         <w:r>
           <w:delText>方案三：采购扩充算力，全国三档分辨率，61天DDL</w:delText>
         </w:r>
       </w:del>
-      <w:ins w:id="12" w:author="Codex 审阅" w:date="2026-07-16T07:07:36+00:00">
+      <w:ins w:id="12" w:author="Codex 审阅" w:date="2026-07-16T07:20:40+00:00">
         <w:r>
           <w:t>方案三：在通过数据与吞吐阶段门后扩充算力，建设全国 10 m 主底座；5 m/2 m 作为有授权高分数据支撑的区域增强路线</w:t>
         </w:r>
@@ -1073,12 +1073,12 @@
         <w:pStyle w:val="aa"/>
       </w:pPr>
       <w:commentRangeStart w:id="4"/>
-      <w:del w:id="13" w:author="Codex 审阅" w:date="2026-07-16T07:07:36+00:00">
+      <w:del w:id="13" w:author="Codex 审阅" w:date="2026-07-16T07:20:40+00:00">
         <w:r>
           <w:delText>可采购H100/H800/A100/A800/910C，10/1-11/30完成训练</w:delText>
         </w:r>
       </w:del>
-      <w:ins w:id="14" w:author="Codex 审阅" w:date="2026-07-16T07:07:36+00:00">
+      <w:ins w:id="14" w:author="Codex 审阅" w:date="2026-07-16T07:20:40+00:00">
         <w:r>
           <w:t>候选算力包括 910C 与合规可采购 GPU；10/1-11/30 仅作为目标训练窗口，须在前置数据就绪、集群网络、HCCL 扩展效率与 1,000-step 基准验收后确认</w:t>
         </w:r>
@@ -1153,12 +1153,12 @@
               <w:pStyle w:val="Compact"/>
             </w:pPr>
             <w:commentRangeStart w:id="5"/>
-            <w:del w:id="23" w:author="Codex 审阅" w:date="2026-07-16T07:07:36+00:00">
+            <w:del w:id="23" w:author="Codex 审阅" w:date="2026-07-16T07:20:40+00:00">
               <w:r>
                 <w:delText>有效算力</w:delText>
               </w:r>
             </w:del>
-            <w:ins w:id="24" w:author="Codex 审阅" w:date="2026-07-16T07:07:36+00:00">
+            <w:ins w:id="24" w:author="Codex 审阅" w:date="2026-07-16T07:20:40+00:00">
               <w:r>
                 <w:t>有效训练吞吐（待实测）</w:t>
               </w:r>
@@ -1853,12 +1853,12 @@
               <w:pStyle w:val="Compact"/>
             </w:pPr>
             <w:commentRangeStart w:id="6"/>
-            <w:del w:id="25" w:author="Codex 审阅" w:date="2026-07-16T07:07:36+00:00">
+            <w:del w:id="25" w:author="Codex 审阅" w:date="2026-07-16T07:20:40+00:00">
               <w:r>
                 <w:delText>单卡参考价</w:delText>
               </w:r>
             </w:del>
-            <w:ins w:id="26" w:author="Codex 审阅" w:date="2026-07-16T07:07:36+00:00">
+            <w:ins w:id="26" w:author="Codex 审阅" w:date="2026-07-16T07:20:40+00:00">
               <w:r>
                 <w:t>采购估算单价（须询价）</w:t>
               </w:r>
@@ -2773,12 +2773,12 @@
           <w:numId w:val="12"/>
         </w:numPr>
       </w:pPr>
-      <w:del w:id="15" w:author="Codex 审阅" w:date="2026-07-16T07:07:36+00:00">
+      <w:del w:id="15" w:author="Codex 审阅" w:date="2026-07-16T07:20:40+00:00">
         <w:r>
           <w:delText>10m/5m目标：910C即可满足，64-256卡，成本仅0.04-0.18亿，强烈推荐。</w:delText>
         </w:r>
       </w:del>
-      <w:ins w:id="16" w:author="Codex 审阅" w:date="2026-07-16T07:07:36+00:00">
+      <w:ins w:id="16" w:author="Codex 审阅" w:date="2026-07-16T07:20:40+00:00">
         <w:r>
           <w:t>10 m 目标：以实测吞吐、并行效率和全口径 TCO 为依据确定 910C 集群规模；5 m 只有在全国高分数据的授权、覆盖、时相与配准均满足时才进入预算评审。</w:t>
         </w:r>
@@ -2793,12 +2793,12 @@
         </w:numPr>
       </w:pPr>
       <w:commentRangeStart w:id="7"/>
-      <w:del w:id="17" w:author="Codex 审阅" w:date="2026-07-16T07:07:36+00:00">
+      <w:del w:id="17" w:author="Codex 审阅" w:date="2026-07-16T07:20:40+00:00">
         <w:r>
           <w:delText>2m目标：成本跃升至1.8-4.2亿，卡数需求1,600-2,800张。受8/1启动、61天训练窗口限制，卡数需求比6/22启动方案增加约60%。</w:delText>
         </w:r>
       </w:del>
-      <w:ins w:id="18" w:author="Codex 审阅" w:date="2026-07-16T07:07:36+00:00">
+      <w:ins w:id="18" w:author="Codex 审阅" w:date="2026-07-16T07:20:40+00:00">
         <w:r>
           <w:t>2 m 目标不应与全国 10 m 主预训练并列承诺：其主要瓶颈是高分数据授权与覆盖、存储和 I/O，而非单纯卡数；建议改为完成 10 m 主底座后的重点城市/行业区域增强路线。</w:t>
         </w:r>
@@ -4392,105 +4392,105 @@
 
 <file path=word/comments.xml><?xml version="1.0" encoding="utf-8"?>
 <w:comments xmlns:w="http://schemas.openxmlformats.org/wordprocessingml/2006/main">
-  <w:comment w:id="0" w:author="Codex 审阅" w:date="2026-07-16T07:07:36+00:00">
+  <w:comment w:id="0" w:author="Codex 审阅" w:date="2026-07-16T07:20:40+00:00">
     <w:p>
       <w:r>
         <w:t>资源口径需要拆开写：当前节点可见 8 张 910B4，项目已稳定验证 6 卡并行；P10C 海淀生产基线（320 patch、6 个月、800 epoch、每卡 batch=3、梯度累积=2）从 2026-07-04 16:53:29 至 2026-07-05 10:43:01 保存 epoch_800，实测 17 小时49分32秒。该时间包含验证/保存，不含导出和下游评测，且从 P9B 权重继续训练，不能写作从零预训练。“16 卡”若为两节点集群，须再写明节点数、HCCL 拓扑、网络带宽、可独占时段和故障替补策略。</w:t>
       </w:r>
     </w:p>
   </w:comment>
-  <w:comment w:id="1" w:author="Codex 审阅" w:date="2026-07-16T07:07:36+00:00">
+  <w:comment w:id="1" w:author="Codex 审阅" w:date="2026-07-16T07:20:40+00:00">
     <w:p>
       <w:r>
         <w:t>关键技术修改：Sentinel-2/Sentinel-1/Landsat 的原生空间信息不是 5 m 或 2 m。把全国主预训练直接改成 5 m/2 m 会把上采样当成新增信息。建议明确：10 m 是主 embedding 网格；高分光学/SAR 是稀疏辅助模态；5 m/2 m 仅依赖另行取得且可合法训练的高分数据。</w:t>
       </w:r>
     </w:p>
   </w:comment>
-  <w:comment w:id="2" w:author="Codex 审阅" w:date="2026-07-16T07:07:36+00:00">
+  <w:comment w:id="2" w:author="Codex 审阅" w:date="2026-07-16T07:20:40+00:00">
     <w:p>
       <w:r>
-        <w:t>“30%”不能只是面积比例。需在附录列出分层：省份/生态区/土地覆盖/城乡梯度/云量带，并固定每月最小有效像素比例。否则训练集可能集中在易获取、低云区域，无法代表中国尺度泛化。</w:t>
+        <w:t>“30%”不能只是面积比例。数据审查阶段建议使用二维 10×10 系统抽样：真实网格横向、纵向各每 10 个 patch 取 1 个，即 1%，并在各分层内随机起始相位；不可简化为每 100 个编号抽一个。附录还需列出省份/生态区/土地覆盖/城乡梯度/云量带，并固定每月最小有效像素比例。否则训练集可能集中在易获取、低云区域，无法代表中国尺度泛化。</w:t>
       </w:r>
     </w:p>
   </w:comment>
-  <w:comment w:id="3" w:author="Codex 审阅" w:date="2026-07-16T07:07:36+00:00">
+  <w:comment w:id="3" w:author="Codex 审阅" w:date="2026-07-16T07:20:40+00:00">
     <w:p>
       <w:r>
         <w:t>请删去把“小数据 800 epoch”直接放大到全国的做法。P10C 海淀实测为 320×800=25.6 万 patch-visits，6 卡 17小时49分32秒，即 2,393.6 patch-visits/卡·小时；全国30%约175.8万 patch，若仍跑800 epoch，16卡完全线性也约需1,530天。样本规模改变后，epoch不是可比单位；应统一为优化步数、全局 batch、有效像素数、混合精度、数据读取命中率和实际 samples/s。先跑 1,000 step 基准，再得出卡数和 ETA。</w:t>
       </w:r>
     </w:p>
   </w:comment>
-  <w:comment w:id="4" w:author="Codex 审阅" w:date="2026-07-16T07:07:36+00:00">
+  <w:comment w:id="4" w:author="Codex 审阅" w:date="2026-07-16T07:20:40+00:00">
     <w:p>
       <w:r>
         <w:t>采购表要把“加速卡数量”改为“完整集群”：计算卡、节点 CPU/RAM、本地 NVMe 缓存、RoCE/IB 网络、对象存储、备份、运维和电力。全国数据训练常先被 I/O 限速，单卡 TFLOPS 不能直接推导完成天数。</w:t>
       </w:r>
     </w:p>
   </w:comment>
-  <w:comment w:id="5" w:author="Codex 审阅" w:date="2026-07-16T07:07:36+00:00">
+  <w:comment w:id="5" w:author="Codex 审阅" w:date="2026-07-16T07:20:40+00:00">
     <w:p>
       <w:r>
         <w:t>建议删除或弱化这一列的纯 TFLOPS 比较。不同卡的 BF16/FP16、算子、显存、通信、软件栈和数据管线不同；请改为同一训练脚本、同一全局 batch 下的实测 step/s、tokens/pixels/s 与 16/32/64 卡扩展效率。</w:t>
       </w:r>
     </w:p>
   </w:comment>
-  <w:comment w:id="6" w:author="Codex 审阅" w:date="2026-07-16T07:07:36+00:00">
+  <w:comment w:id="6" w:author="Codex 审阅" w:date="2026-07-16T07:20:40+00:00">
     <w:p>
       <w:r>
         <w:t>价格不能作为固定事实。补充“报价日期、含税/维保年限、服务器与网络是否包含、采购或租赁、交期、替代料”。尤其 H800/A800 的可得性与合规性需要供应商书面确认。</w:t>
       </w:r>
     </w:p>
   </w:comment>
-  <w:comment w:id="7" w:author="Codex 审阅" w:date="2026-07-16T07:07:36+00:00">
+  <w:comment w:id="7" w:author="Codex 审阅" w:date="2026-07-16T07:20:40+00:00">
     <w:p>
       <w:r>
         <w:t>请按当前实际导出格式，而不是理论FP16格式估算：P10C 的 64维、128×128 embedding map 目前以 FP32 保存，海淀320 patch、6个月实测7.51GiB。线性外推30%全国、6个月，10 m约44 TB；5 m约177 TB；2 m约1.11 PB，尚未包括输入、临时缓存、版本和副本。验证FP16导出后才可将这些值约减半。因此 2 m 必须单列数据、存储和交付方案。</w:t>
       </w:r>
     </w:p>
   </w:comment>
-  <w:comment w:id="8" w:author="Codex 审阅" w:date="2026-07-16T07:07:36+00:00">
+  <w:comment w:id="8" w:author="Codex 审阅" w:date="2026-07-16T07:20:40+00:00">
     <w:p>
       <w:r>
         <w:t>原表存在算术不一致：265 天在 16 卡上的工作量若压缩到 107 天，线性比例为 265/107×16≈40 张，总追加约 24 张，不是 45 张总量。更重要的是，多节点通信损失会使线性估算偏乐观。</w:t>
       </w:r>
     </w:p>
   </w:comment>
-  <w:comment w:id="9" w:author="Codex 审阅" w:date="2026-07-16T07:07:36+00:00">
+  <w:comment w:id="9" w:author="Codex 审阅" w:date="2026-07-16T07:20:40+00:00">
     <w:p>
       <w:r>
         <w:t>请勿默认 910B 与 H 系列/A 系列可以混入同一个分布式训练作业并线性抵扣采购卡数。若不能完成混合 HCCL/NCCL 和算子兼容性压测，现有 910B 应单独承担数据预处理、评测、消融或独立训练。</w:t>
       </w:r>
     </w:p>
   </w:comment>
-  <w:comment w:id="10" w:author="Codex 审阅" w:date="2026-07-16T07:07:36+00:00">
+  <w:comment w:id="10" w:author="Codex 审阅" w:date="2026-07-16T07:20:40+00:00">
     <w:p>
       <w:r>
         <w:t>建议新增“阶段门与验收指标”一页：G0 数据许可/覆盖/云质量通过；G1 10 万 patch 数据管线通过；G2 16→24→32 卡扩展效率验收；G3 跨区域轻量 probe 和少样本任务优于 raw/传统基线；G4 发布前独立标签与时相留出评测。以当前P10C实测速率估算，40万 updates 在16卡、70%效率下含20%缓冲约71.6天，61天窗口不足；24张同构卡、68%效率下约49.1天，建议作为该目标的最小规模。全国数据约71TB筛选训练包、当前FP32导出约44TB embedding（验证FP16后约22TB），应配0.5PB可用/1PB原始容量、节点NVMe缓存和至少2×200Gb/s互连。没有这些门，采购规模无法被审计。</w:t>
       </w:r>
     </w:p>
   </w:comment>
-  <w:comment w:id="11" w:author="Codex 审阅" w:date="2026-07-16T07:07:36+00:00">
+  <w:comment w:id="11" w:author="Codex 审阅" w:date="2026-07-16T07:20:40+00:00">
     <w:p>
       <w:r>
         <w:t>建议在首页增加一句定位：本项目借鉴 AlphaEarth 的“多源观测→统一 embedding→少标签下游制图”范式，但不是对官方模型的复刻或性能等价声明。AEF公开训练使用512 TPU v4、56小时、10万步，发布年度10m、64维、8-bit量化embedding；其训练原始数据与发布桶的总存储均未公开。本文可突出中国数据源和月度更新能力，但需单独核算月度数据质量和FP32/FP16/8-bit发布格式的存储成本。</w:t>
       </w:r>
     </w:p>
   </w:comment>
-  <w:comment w:id="12" w:author="Codex 审阅" w:date="2026-07-16T07:07:36+00:00">
+  <w:comment w:id="12" w:author="Codex 审阅" w:date="2026-07-16T07:20:40+00:00">
     <w:p>
       <w:r>
         <w:t>此行有明确逻辑矛盾：6/22 启动时的可用训练窗口为 122 天，表二给出的 5 m 训练需 161 天，仍超期 39 天，不能标为“可接受”。应改为不可行，或列出新增资源/不同训练配方的假设。</w:t>
       </w:r>
     </w:p>
   </w:comment>
-  <w:comment w:id="13" w:author="Codex 审阅" w:date="2026-07-16T07:07:36+00:00">
+  <w:comment w:id="13" w:author="Codex 审阅" w:date="2026-07-16T07:20:40+00:00">
     <w:p>
       <w:r>
         <w:t>表八称 76 天缩至 61 天后所需卡数由 128 增至 256；若其他条件不变，线性倍率仅为 76/61≈1.25。该表混用了不同芯片、不同配方或未说明裕量，必须按同一实测吞吐公式重算。</w:t>
       </w:r>
     </w:p>
   </w:comment>
-  <w:comment w:id="14" w:author="Codex 审阅" w:date="2026-07-16T07:07:36+00:00">
+  <w:comment w:id="14" w:author="Codex 审阅" w:date="2026-07-16T07:20:40+00:00">
     <w:p>
       <w:r>
         <w:t>1,280 到 1,664–2,816 的增幅为约 30%–120%，不是表中写的“30–55%”。更重要的是，当前数据只有约 3 m 高分光学/SAR，并不能验证全国 2 m 训练数据是否存在。</w:t>

</xml_diff>

<commit_message>
fix: align national sampling table with 1 percent plan
</commit_message>
<xml_diff>
--- a/docs/reviews/china_alpha_earth_three_plans_report_reviewed_20260716.docx
+++ b/docs/reviews/china_alpha_earth_three_plans_report_reviewed_20260716.docx
@@ -7,12 +7,12 @@
         <w:pStyle w:val="1"/>
       </w:pPr>
       <w:commentRangeStart w:id="11"/>
-      <w:del w:id="1" w:author="Codex 审阅" w:date="2026-07-16T07:20:40+00:00">
+      <w:del w:id="1" w:author="Codex 审阅" w:date="2026-07-16T07:38:03+00:00">
         <w:r>
           <w:delText>中国版Alpha Earth 三个落地方案</w:delText>
         </w:r>
       </w:del>
-      <w:ins w:id="2" w:author="Codex 审阅" w:date="2026-07-16T07:20:40+00:00">
+      <w:ins w:id="2" w:author="Codex 审阅" w:date="2026-07-16T07:38:03+00:00">
         <w:r>
           <w:t>中国版 AlphaEarth：10 m 国家级地球观测嵌入的分阶段建设方案</w:t>
         </w:r>
@@ -27,12 +27,12 @@
         <w:pStyle w:val="aa"/>
       </w:pPr>
       <w:commentRangeStart w:id="0"/>
-      <w:del w:id="3" w:author="Codex 审阅" w:date="2026-07-16T07:20:40+00:00">
+      <w:del w:id="3" w:author="Codex 审阅" w:date="2026-07-16T07:38:03+00:00">
         <w:r>
           <w:delText>现有资源：16张昇腾910B | DDL：2026年11月30日 | 启动日期：2026年8月1日</w:delText>
         </w:r>
       </w:del>
-      <w:ins w:id="4" w:author="Codex 审阅" w:date="2026-07-16T07:20:40+00:00">
+      <w:ins w:id="4" w:author="Codex 审阅" w:date="2026-07-16T07:38:03+00:00">
         <w:r>
           <w:t>拟可用资源：16 张昇腾 910B（须完成多节点 HCCL 拓扑、排期与稳定性验收；本项目已验证 6 卡并行） | 目标里程碑：2026 年 11 月 30 日 | 拟启动：2026 年 8 月 1 日</w:t>
         </w:r>
@@ -317,12 +317,12 @@
         <w:pStyle w:val="aa"/>
       </w:pPr>
       <w:commentRangeStart w:id="1"/>
-      <w:del w:id="5" w:author="Codex 审阅" w:date="2026-07-16T07:20:40+00:00">
+      <w:del w:id="5" w:author="Codex 审阅" w:date="2026-07-16T07:38:03+00:00">
         <w:r>
           <w:delText>资源不变，缩小范围，三档分辨率验证</w:delText>
         </w:r>
       </w:del>
-      <w:ins w:id="6" w:author="Codex 审阅" w:date="2026-07-16T07:20:40+00:00">
+      <w:ins w:id="6" w:author="Codex 审阅" w:date="2026-07-16T07:38:03+00:00">
         <w:r>
           <w:t>资源不变，先完成 10 m 多模态月度嵌入试点；5 m/2 m 仅在高分数据授权、覆盖和配准通过后作为区域增强验证</w:t>
         </w:r>
@@ -337,12 +337,12 @@
         <w:pStyle w:val="FirstParagraph"/>
       </w:pPr>
       <w:commentRangeStart w:id="2"/>
-      <w:del w:id="7" w:author="Codex 审阅" w:date="2026-07-16T07:20:40+00:00">
+      <w:del w:id="7" w:author="Codex 审阅" w:date="2026-07-16T07:38:03+00:00">
         <w:r>
           <w:delText>东北训练面积：80.8万km² × 30% = 24.2万km² | 可用训练窗口：107天</w:delText>
         </w:r>
       </w:del>
-      <w:ins w:id="8" w:author="Codex 审阅" w:date="2026-07-16T07:20:40+00:00">
+      <w:ins w:id="8" w:author="Codex 审阅" w:date="2026-07-16T07:38:03+00:00">
         <w:r>
           <w:t>东北训练范围：80.8 万 km² × 30% = 24.2 万 km²；须说明 30% 的分层抽样规则、覆盖生态区和每月有效观测阈值 | 名义训练窗口：107 天</w:t>
         </w:r>
@@ -654,12 +654,12 @@
         <w:pStyle w:val="a0"/>
       </w:pPr>
       <w:commentRangeStart w:id="3"/>
-      <w:del w:id="9" w:author="Codex 审阅" w:date="2026-07-16T07:20:40+00:00">
+      <w:del w:id="9" w:author="Codex 审阅" w:date="2026-07-16T07:38:03+00:00">
         <w:r>
           <w:delText>建议：优先做10m东北底座，22天即可完成，作为团队技术验证和首版成果。</w:delText>
         </w:r>
       </w:del>
-      <w:ins w:id="10" w:author="Codex 审阅" w:date="2026-07-16T07:20:40+00:00">
+      <w:ins w:id="10" w:author="Codex 审阅" w:date="2026-07-16T07:38:03+00:00">
         <w:r>
           <w:t>建议：优先建设 10 m 东北试点底座，先用固定优化步数的 1,000-step 吞吐基准和数据就绪率复算工期，再作为团队技术验证与首版成果。</w:t>
         </w:r>
@@ -946,12 +946,12 @@
               <w:pStyle w:val="Compact"/>
             </w:pPr>
             <w:commentRangeStart w:id="8"/>
-            <w:del w:id="19" w:author="Codex 审阅" w:date="2026-07-16T07:20:40+00:00">
+            <w:del w:id="19" w:author="Codex 审阅" w:date="2026-07-16T07:38:03+00:00">
               <w:r>
                 <w:delText>如需107天完成，需追加</w:delText>
               </w:r>
             </w:del>
-            <w:ins w:id="20" w:author="Codex 审阅" w:date="2026-07-16T07:20:40+00:00">
+            <w:ins w:id="20" w:author="Codex 审阅" w:date="2026-07-16T07:38:03+00:00">
               <w:r>
                 <w:t>如需 107 天完成（线性外推，未计多节点效率损失）</w:t>
               </w:r>
@@ -970,12 +970,12 @@
             <w:pPr>
               <w:pStyle w:val="Compact"/>
             </w:pPr>
-            <w:del w:id="21" w:author="Codex 审阅" w:date="2026-07-16T07:20:40+00:00">
+            <w:del w:id="21" w:author="Codex 审阅" w:date="2026-07-16T07:38:03+00:00">
               <w:r>
                 <w:delText>29卡910B（共45卡）</w:delText>
               </w:r>
             </w:del>
-            <w:ins w:id="22" w:author="Codex 审阅" w:date="2026-07-16T07:20:40+00:00">
+            <w:ins w:id="22" w:author="Codex 审阅" w:date="2026-07-16T07:38:03+00:00">
               <w:r>
                 <w:t>约需追加 24 张 910B（共 40 张）；最终数值须由固定步数吞吐基准复算</w:t>
               </w:r>
@@ -1053,12 +1053,12 @@
         <w:pStyle w:val="2"/>
       </w:pPr>
       <w:commentRangeStart w:id="10"/>
-      <w:del w:id="11" w:author="Codex 审阅" w:date="2026-07-16T07:20:40+00:00">
+      <w:del w:id="11" w:author="Codex 审阅" w:date="2026-07-16T07:38:03+00:00">
         <w:r>
           <w:delText>方案三：采购扩充算力，全国三档分辨率，61天DDL</w:delText>
         </w:r>
       </w:del>
-      <w:ins w:id="12" w:author="Codex 审阅" w:date="2026-07-16T07:20:40+00:00">
+      <w:ins w:id="12" w:author="Codex 审阅" w:date="2026-07-16T07:38:03+00:00">
         <w:r>
           <w:t>方案三：在通过数据与吞吐阶段门后扩充算力，建设全国 10 m 主底座；5 m/2 m 作为有授权高分数据支撑的区域增强路线</w:t>
         </w:r>
@@ -1073,12 +1073,12 @@
         <w:pStyle w:val="aa"/>
       </w:pPr>
       <w:commentRangeStart w:id="4"/>
-      <w:del w:id="13" w:author="Codex 审阅" w:date="2026-07-16T07:20:40+00:00">
+      <w:del w:id="13" w:author="Codex 审阅" w:date="2026-07-16T07:38:03+00:00">
         <w:r>
           <w:delText>可采购H100/H800/A100/A800/910C，10/1-11/30完成训练</w:delText>
         </w:r>
       </w:del>
-      <w:ins w:id="14" w:author="Codex 审阅" w:date="2026-07-16T07:20:40+00:00">
+      <w:ins w:id="14" w:author="Codex 审阅" w:date="2026-07-16T07:38:03+00:00">
         <w:r>
           <w:t>候选算力包括 910C 与合规可采购 GPU；10/1-11/30 仅作为目标训练窗口，须在前置数据就绪、集群网络、HCCL 扩展效率与 1,000-step 基准验收后确认</w:t>
         </w:r>
@@ -1153,12 +1153,12 @@
               <w:pStyle w:val="Compact"/>
             </w:pPr>
             <w:commentRangeStart w:id="5"/>
-            <w:del w:id="23" w:author="Codex 审阅" w:date="2026-07-16T07:20:40+00:00">
+            <w:del w:id="23" w:author="Codex 审阅" w:date="2026-07-16T07:38:03+00:00">
               <w:r>
                 <w:delText>有效算力</w:delText>
               </w:r>
             </w:del>
-            <w:ins w:id="24" w:author="Codex 审阅" w:date="2026-07-16T07:20:40+00:00">
+            <w:ins w:id="24" w:author="Codex 审阅" w:date="2026-07-16T07:38:03+00:00">
               <w:r>
                 <w:t>有效训练吞吐（待实测）</w:t>
               </w:r>
@@ -1853,12 +1853,12 @@
               <w:pStyle w:val="Compact"/>
             </w:pPr>
             <w:commentRangeStart w:id="6"/>
-            <w:del w:id="25" w:author="Codex 审阅" w:date="2026-07-16T07:20:40+00:00">
+            <w:del w:id="25" w:author="Codex 审阅" w:date="2026-07-16T07:38:03+00:00">
               <w:r>
                 <w:delText>单卡参考价</w:delText>
               </w:r>
             </w:del>
-            <w:ins w:id="26" w:author="Codex 审阅" w:date="2026-07-16T07:20:40+00:00">
+            <w:ins w:id="26" w:author="Codex 审阅" w:date="2026-07-16T07:38:03+00:00">
               <w:r>
                 <w:t>采购估算单价（须询价）</w:t>
               </w:r>
@@ -2773,12 +2773,12 @@
           <w:numId w:val="12"/>
         </w:numPr>
       </w:pPr>
-      <w:del w:id="15" w:author="Codex 审阅" w:date="2026-07-16T07:20:40+00:00">
+      <w:del w:id="15" w:author="Codex 审阅" w:date="2026-07-16T07:38:03+00:00">
         <w:r>
           <w:delText>10m/5m目标：910C即可满足，64-256卡，成本仅0.04-0.18亿，强烈推荐。</w:delText>
         </w:r>
       </w:del>
-      <w:ins w:id="16" w:author="Codex 审阅" w:date="2026-07-16T07:20:40+00:00">
+      <w:ins w:id="16" w:author="Codex 审阅" w:date="2026-07-16T07:38:03+00:00">
         <w:r>
           <w:t>10 m 目标：以实测吞吐、并行效率和全口径 TCO 为依据确定 910C 集群规模；5 m 只有在全国高分数据的授权、覆盖、时相与配准均满足时才进入预算评审。</w:t>
         </w:r>
@@ -2793,12 +2793,12 @@
         </w:numPr>
       </w:pPr>
       <w:commentRangeStart w:id="7"/>
-      <w:del w:id="17" w:author="Codex 审阅" w:date="2026-07-16T07:20:40+00:00">
+      <w:del w:id="17" w:author="Codex 审阅" w:date="2026-07-16T07:38:03+00:00">
         <w:r>
           <w:delText>2m目标：成本跃升至1.8-4.2亿，卡数需求1,600-2,800张。受8/1启动、61天训练窗口限制，卡数需求比6/22启动方案增加约60%。</w:delText>
         </w:r>
       </w:del>
-      <w:ins w:id="18" w:author="Codex 审阅" w:date="2026-07-16T07:20:40+00:00">
+      <w:ins w:id="18" w:author="Codex 审阅" w:date="2026-07-16T07:38:03+00:00">
         <w:r>
           <w:t>2 m 目标不应与全国 10 m 主预训练并列承诺：其主要瓶颈是高分数据授权与覆盖、存储和 I/O，而非单纯卡数；建议改为完成 10 m 主底座后的重点城市/行业区域增强路线。</w:t>
         </w:r>
@@ -4392,105 +4392,105 @@
 
 <file path=word/comments.xml><?xml version="1.0" encoding="utf-8"?>
 <w:comments xmlns:w="http://schemas.openxmlformats.org/wordprocessingml/2006/main">
-  <w:comment w:id="0" w:author="Codex 审阅" w:date="2026-07-16T07:20:40+00:00">
+  <w:comment w:id="0" w:author="Codex 审阅" w:date="2026-07-16T07:38:03+00:00">
     <w:p>
       <w:r>
         <w:t>资源口径需要拆开写：当前节点可见 8 张 910B4，项目已稳定验证 6 卡并行；P10C 海淀生产基线（320 patch、6 个月、800 epoch、每卡 batch=3、梯度累积=2）从 2026-07-04 16:53:29 至 2026-07-05 10:43:01 保存 epoch_800，实测 17 小时49分32秒。该时间包含验证/保存，不含导出和下游评测，且从 P9B 权重继续训练，不能写作从零预训练。“16 卡”若为两节点集群，须再写明节点数、HCCL 拓扑、网络带宽、可独占时段和故障替补策略。</w:t>
       </w:r>
     </w:p>
   </w:comment>
-  <w:comment w:id="1" w:author="Codex 审阅" w:date="2026-07-16T07:20:40+00:00">
+  <w:comment w:id="1" w:author="Codex 审阅" w:date="2026-07-16T07:38:03+00:00">
     <w:p>
       <w:r>
         <w:t>关键技术修改：Sentinel-2/Sentinel-1/Landsat 的原生空间信息不是 5 m 或 2 m。把全国主预训练直接改成 5 m/2 m 会把上采样当成新增信息。建议明确：10 m 是主 embedding 网格；高分光学/SAR 是稀疏辅助模态；5 m/2 m 仅依赖另行取得且可合法训练的高分数据。</w:t>
       </w:r>
     </w:p>
   </w:comment>
-  <w:comment w:id="2" w:author="Codex 审阅" w:date="2026-07-16T07:20:40+00:00">
+  <w:comment w:id="2" w:author="Codex 审阅" w:date="2026-07-16T07:38:03+00:00">
     <w:p>
       <w:r>
         <w:t>“30%”不能只是面积比例。数据审查阶段建议使用二维 10×10 系统抽样：真实网格横向、纵向各每 10 个 patch 取 1 个，即 1%，并在各分层内随机起始相位；不可简化为每 100 个编号抽一个。附录还需列出省份/生态区/土地覆盖/城乡梯度/云量带，并固定每月最小有效像素比例。否则训练集可能集中在易获取、低云区域，无法代表中国尺度泛化。</w:t>
       </w:r>
     </w:p>
   </w:comment>
-  <w:comment w:id="3" w:author="Codex 审阅" w:date="2026-07-16T07:20:40+00:00">
+  <w:comment w:id="3" w:author="Codex 审阅" w:date="2026-07-16T07:38:03+00:00">
     <w:p>
       <w:r>
         <w:t>请删去把“小数据 800 epoch”直接放大到全国的做法。P10C 海淀实测为 320×800=25.6 万 patch-visits，6 卡 17小时49分32秒，即 2,393.6 patch-visits/卡·小时；全国30%约175.8万 patch，若仍跑800 epoch，16卡完全线性也约需1,530天。样本规模改变后，epoch不是可比单位；应统一为优化步数、全局 batch、有效像素数、混合精度、数据读取命中率和实际 samples/s。先跑 1,000 step 基准，再得出卡数和 ETA。</w:t>
       </w:r>
     </w:p>
   </w:comment>
-  <w:comment w:id="4" w:author="Codex 审阅" w:date="2026-07-16T07:20:40+00:00">
+  <w:comment w:id="4" w:author="Codex 审阅" w:date="2026-07-16T07:38:03+00:00">
     <w:p>
       <w:r>
         <w:t>采购表要把“加速卡数量”改为“完整集群”：计算卡、节点 CPU/RAM、本地 NVMe 缓存、RoCE/IB 网络、对象存储、备份、运维和电力。全国数据训练常先被 I/O 限速，单卡 TFLOPS 不能直接推导完成天数。</w:t>
       </w:r>
     </w:p>
   </w:comment>
-  <w:comment w:id="5" w:author="Codex 审阅" w:date="2026-07-16T07:20:40+00:00">
+  <w:comment w:id="5" w:author="Codex 审阅" w:date="2026-07-16T07:38:03+00:00">
     <w:p>
       <w:r>
         <w:t>建议删除或弱化这一列的纯 TFLOPS 比较。不同卡的 BF16/FP16、算子、显存、通信、软件栈和数据管线不同；请改为同一训练脚本、同一全局 batch 下的实测 step/s、tokens/pixels/s 与 16/32/64 卡扩展效率。</w:t>
       </w:r>
     </w:p>
   </w:comment>
-  <w:comment w:id="6" w:author="Codex 审阅" w:date="2026-07-16T07:20:40+00:00">
+  <w:comment w:id="6" w:author="Codex 审阅" w:date="2026-07-16T07:38:03+00:00">
     <w:p>
       <w:r>
         <w:t>价格不能作为固定事实。补充“报价日期、含税/维保年限、服务器与网络是否包含、采购或租赁、交期、替代料”。尤其 H800/A800 的可得性与合规性需要供应商书面确认。</w:t>
       </w:r>
     </w:p>
   </w:comment>
-  <w:comment w:id="7" w:author="Codex 审阅" w:date="2026-07-16T07:20:40+00:00">
+  <w:comment w:id="7" w:author="Codex 审阅" w:date="2026-07-16T07:38:03+00:00">
     <w:p>
       <w:r>
         <w:t>请按当前实际导出格式，而不是理论FP16格式估算：P10C 的 64维、128×128 embedding map 目前以 FP32 保存，海淀320 patch、6个月实测7.51GiB。线性外推30%全国、6个月，10 m约44 TB；5 m约177 TB；2 m约1.11 PB，尚未包括输入、临时缓存、版本和副本。验证FP16导出后才可将这些值约减半。因此 2 m 必须单列数据、存储和交付方案。</w:t>
       </w:r>
     </w:p>
   </w:comment>
-  <w:comment w:id="8" w:author="Codex 审阅" w:date="2026-07-16T07:20:40+00:00">
+  <w:comment w:id="8" w:author="Codex 审阅" w:date="2026-07-16T07:38:03+00:00">
     <w:p>
       <w:r>
         <w:t>原表存在算术不一致：265 天在 16 卡上的工作量若压缩到 107 天，线性比例为 265/107×16≈40 张，总追加约 24 张，不是 45 张总量。更重要的是，多节点通信损失会使线性估算偏乐观。</w:t>
       </w:r>
     </w:p>
   </w:comment>
-  <w:comment w:id="9" w:author="Codex 审阅" w:date="2026-07-16T07:20:40+00:00">
+  <w:comment w:id="9" w:author="Codex 审阅" w:date="2026-07-16T07:38:03+00:00">
     <w:p>
       <w:r>
         <w:t>请勿默认 910B 与 H 系列/A 系列可以混入同一个分布式训练作业并线性抵扣采购卡数。若不能完成混合 HCCL/NCCL 和算子兼容性压测，现有 910B 应单独承担数据预处理、评测、消融或独立训练。</w:t>
       </w:r>
     </w:p>
   </w:comment>
-  <w:comment w:id="10" w:author="Codex 审阅" w:date="2026-07-16T07:20:40+00:00">
+  <w:comment w:id="10" w:author="Codex 审阅" w:date="2026-07-16T07:38:03+00:00">
     <w:p>
       <w:r>
         <w:t>建议新增“阶段门与验收指标”一页：G0 数据许可/覆盖/云质量通过；G1 10 万 patch 数据管线通过；G2 16→24→32 卡扩展效率验收；G3 跨区域轻量 probe 和少样本任务优于 raw/传统基线；G4 发布前独立标签与时相留出评测。以当前P10C实测速率估算，40万 updates 在16卡、70%效率下含20%缓冲约71.6天，61天窗口不足；24张同构卡、68%效率下约49.1天，建议作为该目标的最小规模。全国数据约71TB筛选训练包、当前FP32导出约44TB embedding（验证FP16后约22TB），应配0.5PB可用/1PB原始容量、节点NVMe缓存和至少2×200Gb/s互连。没有这些门，采购规模无法被审计。</w:t>
       </w:r>
     </w:p>
   </w:comment>
-  <w:comment w:id="11" w:author="Codex 审阅" w:date="2026-07-16T07:20:40+00:00">
+  <w:comment w:id="11" w:author="Codex 审阅" w:date="2026-07-16T07:38:03+00:00">
     <w:p>
       <w:r>
         <w:t>建议在首页增加一句定位：本项目借鉴 AlphaEarth 的“多源观测→统一 embedding→少标签下游制图”范式，但不是对官方模型的复刻或性能等价声明。AEF公开训练使用512 TPU v4、56小时、10万步，发布年度10m、64维、8-bit量化embedding；其训练原始数据与发布桶的总存储均未公开。本文可突出中国数据源和月度更新能力，但需单独核算月度数据质量和FP32/FP16/8-bit发布格式的存储成本。</w:t>
       </w:r>
     </w:p>
   </w:comment>
-  <w:comment w:id="12" w:author="Codex 审阅" w:date="2026-07-16T07:20:40+00:00">
+  <w:comment w:id="12" w:author="Codex 审阅" w:date="2026-07-16T07:38:03+00:00">
     <w:p>
       <w:r>
         <w:t>此行有明确逻辑矛盾：6/22 启动时的可用训练窗口为 122 天，表二给出的 5 m 训练需 161 天，仍超期 39 天，不能标为“可接受”。应改为不可行，或列出新增资源/不同训练配方的假设。</w:t>
       </w:r>
     </w:p>
   </w:comment>
-  <w:comment w:id="13" w:author="Codex 审阅" w:date="2026-07-16T07:20:40+00:00">
+  <w:comment w:id="13" w:author="Codex 审阅" w:date="2026-07-16T07:38:03+00:00">
     <w:p>
       <w:r>
         <w:t>表八称 76 天缩至 61 天后所需卡数由 128 增至 256；若其他条件不变，线性倍率仅为 76/61≈1.25。该表混用了不同芯片、不同配方或未说明裕量，必须按同一实测吞吐公式重算。</w:t>
       </w:r>
     </w:p>
   </w:comment>
-  <w:comment w:id="14" w:author="Codex 审阅" w:date="2026-07-16T07:20:40+00:00">
+  <w:comment w:id="14" w:author="Codex 审阅" w:date="2026-07-16T07:38:03+00:00">
     <w:p>
       <w:r>
         <w:t>1,280 到 1,664–2,816 的增幅为约 30%–120%，不是表中写的“30–55%”。更重要的是，当前数据只有约 3 m 高分光学/SAR，并不能验证全国 2 m 训练数据是否存在。</w:t>

</xml_diff>